<commit_message>
docs(readme): 补充 v2.0.0/v2.1.0 版本历史
- v2.1.0 (2026-06-27): 新增自定义工具 MVP
  - 工具箱自定义工具分组 + GenericCopyToolForm 通用复制窗体
  - 工具箱预选源/目标账套支持快捷键
  - 自定义工具配置 + 右键编辑/删除
- v2.0.0 (2026-06-17): 三端自动登录
  - Web CDP 自动登录 h5comerp
  - Win32 客户端/开发工具自动登录
  - 跨库复制配置数据 (S_DATASELECT/S_SYSTEMSETTING/S_CUSTOMDATA)
  - AccountDialog 重构为所见即所得
  - 三个 csproj 版本号 1.0.0 -> 2.0.0

附: 更新 A3工具箱_用户手册.docx
</commit_message>
<xml_diff>
--- a/A3工具箱_用户手册.docx
+++ b/A3工具箱_用户手册.docx
@@ -74,6 +74,568 @@
       </w:r>
     </w:p>
     <w:p/>
+    <w:tbl>
+      <w:tblPr>
+        <w:tblStyle w:val="14"/>
+        <w:tblW w:w="0" w:type="auto"/>
+        <w:tblInd w:w="0" w:type="dxa"/>
+        <w:tblBorders>
+          <w:top w:val="single" w:color="auto" w:sz="4" w:space="0"/>
+          <w:left w:val="single" w:color="auto" w:sz="4" w:space="0"/>
+          <w:bottom w:val="single" w:color="auto" w:sz="4" w:space="0"/>
+          <w:right w:val="single" w:color="auto" w:sz="4" w:space="0"/>
+          <w:insideH w:val="single" w:color="auto" w:sz="4" w:space="0"/>
+          <w:insideV w:val="single" w:color="auto" w:sz="4" w:space="0"/>
+        </w:tblBorders>
+        <w:tblLayout w:type="autofit"/>
+        <w:tblCellMar>
+          <w:left w:w="108" w:type="dxa"/>
+          <w:right w:w="108" w:type="dxa"/>
+        </w:tblCellMar>
+      </w:tblPr>
+      <w:tblGrid>
+        <w:gridCol w:w="1547"/>
+        <w:gridCol w:w="1586"/>
+        <w:gridCol w:w="4338"/>
+        <w:gridCol w:w="2491"/>
+      </w:tblGrid>
+      <w:tr>
+        <w:tblPrEx>
+          <w:tblBorders>
+            <w:top w:val="single" w:color="auto" w:sz="4" w:space="0"/>
+            <w:left w:val="single" w:color="auto" w:sz="4" w:space="0"/>
+            <w:bottom w:val="single" w:color="auto" w:sz="4" w:space="0"/>
+            <w:right w:val="single" w:color="auto" w:sz="4" w:space="0"/>
+            <w:insideH w:val="single" w:color="auto" w:sz="4" w:space="0"/>
+            <w:insideV w:val="single" w:color="auto" w:sz="4" w:space="0"/>
+          </w:tblBorders>
+        </w:tblPrEx>
+        <w:tc>
+          <w:tcPr>
+            <w:tcW w:w="1547" w:type="dxa"/>
+          </w:tcPr>
+          <w:p>
+            <w:pPr>
+              <w:jc w:val="center"/>
+              <w:rPr>
+                <w:rFonts w:hint="eastAsia" w:eastAsia="微软雅黑"/>
+                <w:vertAlign w:val="baseline"/>
+                <w:lang w:val="en-US" w:eastAsia="zh-CN"/>
+              </w:rPr>
+            </w:pPr>
+            <w:r>
+              <w:rPr>
+                <w:rFonts w:hint="eastAsia"/>
+                <w:vertAlign w:val="baseline"/>
+                <w:lang w:val="en-US" w:eastAsia="zh-CN"/>
+              </w:rPr>
+              <w:t>版本号</w:t>
+            </w:r>
+          </w:p>
+        </w:tc>
+        <w:tc>
+          <w:tcPr>
+            <w:tcW w:w="1586" w:type="dxa"/>
+          </w:tcPr>
+          <w:p>
+            <w:pPr>
+              <w:jc w:val="center"/>
+              <w:rPr>
+                <w:rFonts w:hint="eastAsia" w:eastAsia="微软雅黑"/>
+                <w:vertAlign w:val="baseline"/>
+                <w:lang w:val="en-US" w:eastAsia="zh-CN"/>
+              </w:rPr>
+            </w:pPr>
+            <w:r>
+              <w:rPr>
+                <w:rFonts w:hint="eastAsia"/>
+                <w:vertAlign w:val="baseline"/>
+                <w:lang w:val="en-US" w:eastAsia="zh-CN"/>
+              </w:rPr>
+              <w:t>修订人</w:t>
+            </w:r>
+          </w:p>
+        </w:tc>
+        <w:tc>
+          <w:tcPr>
+            <w:tcW w:w="4338" w:type="dxa"/>
+          </w:tcPr>
+          <w:p>
+            <w:pPr>
+              <w:jc w:val="center"/>
+              <w:rPr>
+                <w:rFonts w:hint="default" w:eastAsia="微软雅黑"/>
+                <w:vertAlign w:val="baseline"/>
+                <w:lang w:val="en-US" w:eastAsia="zh-CN"/>
+              </w:rPr>
+            </w:pPr>
+            <w:r>
+              <w:rPr>
+                <w:rFonts w:hint="eastAsia"/>
+                <w:vertAlign w:val="baseline"/>
+                <w:lang w:val="en-US" w:eastAsia="zh-CN"/>
+              </w:rPr>
+              <w:t>修订内容</w:t>
+            </w:r>
+          </w:p>
+        </w:tc>
+        <w:tc>
+          <w:tcPr>
+            <w:tcW w:w="2491" w:type="dxa"/>
+          </w:tcPr>
+          <w:p>
+            <w:pPr>
+              <w:jc w:val="center"/>
+              <w:rPr>
+                <w:rFonts w:hint="default" w:eastAsia="微软雅黑"/>
+                <w:vertAlign w:val="baseline"/>
+                <w:lang w:val="en-US" w:eastAsia="zh-CN"/>
+              </w:rPr>
+            </w:pPr>
+            <w:r>
+              <w:rPr>
+                <w:rFonts w:hint="eastAsia"/>
+                <w:vertAlign w:val="baseline"/>
+                <w:lang w:val="en-US" w:eastAsia="zh-CN"/>
+              </w:rPr>
+              <w:t>修订日期</w:t>
+            </w:r>
+          </w:p>
+        </w:tc>
+      </w:tr>
+      <w:tr>
+        <w:tblPrEx>
+          <w:tblBorders>
+            <w:top w:val="single" w:color="auto" w:sz="4" w:space="0"/>
+            <w:left w:val="single" w:color="auto" w:sz="4" w:space="0"/>
+            <w:bottom w:val="single" w:color="auto" w:sz="4" w:space="0"/>
+            <w:right w:val="single" w:color="auto" w:sz="4" w:space="0"/>
+            <w:insideH w:val="single" w:color="auto" w:sz="4" w:space="0"/>
+            <w:insideV w:val="single" w:color="auto" w:sz="4" w:space="0"/>
+          </w:tblBorders>
+          <w:tblCellMar>
+            <w:left w:w="108" w:type="dxa"/>
+            <w:right w:w="108" w:type="dxa"/>
+          </w:tblCellMar>
+        </w:tblPrEx>
+        <w:tc>
+          <w:tcPr>
+            <w:tcW w:w="1547" w:type="dxa"/>
+          </w:tcPr>
+          <w:p>
+            <w:pPr>
+              <w:jc w:val="center"/>
+              <w:rPr>
+                <w:rFonts w:hint="default" w:eastAsia="微软雅黑"/>
+                <w:vertAlign w:val="baseline"/>
+                <w:lang w:val="en-US" w:eastAsia="zh-CN"/>
+              </w:rPr>
+            </w:pPr>
+            <w:r>
+              <w:rPr>
+                <w:rFonts w:hint="eastAsia"/>
+                <w:vertAlign w:val="baseline"/>
+                <w:lang w:val="en-US" w:eastAsia="zh-CN"/>
+              </w:rPr>
+              <w:t>V1.0.0</w:t>
+            </w:r>
+          </w:p>
+        </w:tc>
+        <w:tc>
+          <w:tcPr>
+            <w:tcW w:w="1586" w:type="dxa"/>
+          </w:tcPr>
+          <w:p>
+            <w:pPr>
+              <w:jc w:val="center"/>
+              <w:rPr>
+                <w:rFonts w:hint="default" w:eastAsia="微软雅黑"/>
+                <w:vertAlign w:val="baseline"/>
+                <w:lang w:val="en-US" w:eastAsia="zh-CN"/>
+              </w:rPr>
+            </w:pPr>
+            <w:r>
+              <w:rPr>
+                <w:rFonts w:hint="eastAsia"/>
+                <w:vertAlign w:val="baseline"/>
+                <w:lang w:val="en-US" w:eastAsia="zh-CN"/>
+              </w:rPr>
+              <w:t>wq</w:t>
+            </w:r>
+          </w:p>
+        </w:tc>
+        <w:tc>
+          <w:tcPr>
+            <w:tcW w:w="4338" w:type="dxa"/>
+          </w:tcPr>
+          <w:p>
+            <w:pPr>
+              <w:jc w:val="left"/>
+              <w:rPr>
+                <w:rFonts w:hint="default" w:eastAsia="微软雅黑"/>
+                <w:vertAlign w:val="baseline"/>
+                <w:lang w:val="en-US" w:eastAsia="zh-CN"/>
+              </w:rPr>
+            </w:pPr>
+            <w:r>
+              <w:rPr>
+                <w:rFonts w:hint="eastAsia"/>
+                <w:vertAlign w:val="baseline"/>
+                <w:lang w:val="en-US" w:eastAsia="zh-CN"/>
+              </w:rPr>
+              <w:t>账套管理工具，支持搜索、启动、远程等</w:t>
+            </w:r>
+          </w:p>
+        </w:tc>
+        <w:tc>
+          <w:tcPr>
+            <w:tcW w:w="2491" w:type="dxa"/>
+          </w:tcPr>
+          <w:p>
+            <w:pPr>
+              <w:jc w:val="center"/>
+              <w:rPr>
+                <w:rFonts w:hint="default" w:eastAsia="微软雅黑"/>
+                <w:vertAlign w:val="baseline"/>
+                <w:lang w:val="en-US" w:eastAsia="zh-CN"/>
+              </w:rPr>
+            </w:pPr>
+            <w:r>
+              <w:rPr>
+                <w:rFonts w:hint="eastAsia"/>
+                <w:vertAlign w:val="baseline"/>
+                <w:lang w:val="en-US" w:eastAsia="zh-CN"/>
+              </w:rPr>
+              <w:t>2026-04-18</w:t>
+            </w:r>
+          </w:p>
+        </w:tc>
+      </w:tr>
+      <w:tr>
+        <w:tblPrEx>
+          <w:tblBorders>
+            <w:top w:val="single" w:color="auto" w:sz="4" w:space="0"/>
+            <w:left w:val="single" w:color="auto" w:sz="4" w:space="0"/>
+            <w:bottom w:val="single" w:color="auto" w:sz="4" w:space="0"/>
+            <w:right w:val="single" w:color="auto" w:sz="4" w:space="0"/>
+            <w:insideH w:val="single" w:color="auto" w:sz="4" w:space="0"/>
+            <w:insideV w:val="single" w:color="auto" w:sz="4" w:space="0"/>
+          </w:tblBorders>
+          <w:tblCellMar>
+            <w:left w:w="108" w:type="dxa"/>
+            <w:right w:w="108" w:type="dxa"/>
+          </w:tblCellMar>
+        </w:tblPrEx>
+        <w:tc>
+          <w:tcPr>
+            <w:tcW w:w="1547" w:type="dxa"/>
+          </w:tcPr>
+          <w:p>
+            <w:pPr>
+              <w:jc w:val="center"/>
+              <w:rPr>
+                <w:rFonts w:hint="default" w:eastAsia="微软雅黑"/>
+                <w:vertAlign w:val="baseline"/>
+                <w:lang w:val="en-US" w:eastAsia="zh-CN"/>
+              </w:rPr>
+            </w:pPr>
+            <w:r>
+              <w:rPr>
+                <w:rFonts w:hint="eastAsia"/>
+                <w:vertAlign w:val="baseline"/>
+                <w:lang w:val="en-US" w:eastAsia="zh-CN"/>
+              </w:rPr>
+              <w:t>V1.1.0</w:t>
+            </w:r>
+          </w:p>
+        </w:tc>
+        <w:tc>
+          <w:tcPr>
+            <w:tcW w:w="1586" w:type="dxa"/>
+          </w:tcPr>
+          <w:p>
+            <w:pPr>
+              <w:jc w:val="center"/>
+              <w:rPr>
+                <w:rFonts w:hint="eastAsia" w:eastAsia="微软雅黑"/>
+                <w:vertAlign w:val="baseline"/>
+                <w:lang w:val="en-US" w:eastAsia="zh-CN"/>
+              </w:rPr>
+            </w:pPr>
+            <w:r>
+              <w:rPr>
+                <w:rFonts w:hint="eastAsia"/>
+                <w:vertAlign w:val="baseline"/>
+                <w:lang w:val="en-US" w:eastAsia="zh-CN"/>
+              </w:rPr>
+              <w:t>wq</w:t>
+            </w:r>
+          </w:p>
+        </w:tc>
+        <w:tc>
+          <w:tcPr>
+            <w:tcW w:w="4338" w:type="dxa"/>
+          </w:tcPr>
+          <w:p>
+            <w:pPr>
+              <w:jc w:val="left"/>
+              <w:rPr>
+                <w:rFonts w:hint="default" w:eastAsia="微软雅黑"/>
+                <w:vertAlign w:val="baseline"/>
+                <w:lang w:val="en-US" w:eastAsia="zh-CN"/>
+              </w:rPr>
+            </w:pPr>
+            <w:r>
+              <w:rPr>
+                <w:rFonts w:hint="eastAsia"/>
+                <w:vertAlign w:val="baseline"/>
+                <w:lang w:val="en-US" w:eastAsia="zh-CN"/>
+              </w:rPr>
+              <w:t>新增托盘、快捷键等</w:t>
+            </w:r>
+          </w:p>
+        </w:tc>
+        <w:tc>
+          <w:tcPr>
+            <w:tcW w:w="2491" w:type="dxa"/>
+          </w:tcPr>
+          <w:p>
+            <w:pPr>
+              <w:jc w:val="center"/>
+              <w:rPr>
+                <w:rFonts w:hint="default" w:eastAsia="微软雅黑"/>
+                <w:vertAlign w:val="baseline"/>
+                <w:lang w:val="en-US" w:eastAsia="zh-CN"/>
+              </w:rPr>
+            </w:pPr>
+            <w:r>
+              <w:rPr>
+                <w:rFonts w:hint="eastAsia"/>
+                <w:vertAlign w:val="baseline"/>
+                <w:lang w:val="en-US" w:eastAsia="zh-CN"/>
+              </w:rPr>
+              <w:t>2026-04-30</w:t>
+            </w:r>
+          </w:p>
+        </w:tc>
+      </w:tr>
+      <w:tr>
+        <w:tblPrEx>
+          <w:tblBorders>
+            <w:top w:val="single" w:color="auto" w:sz="4" w:space="0"/>
+            <w:left w:val="single" w:color="auto" w:sz="4" w:space="0"/>
+            <w:bottom w:val="single" w:color="auto" w:sz="4" w:space="0"/>
+            <w:right w:val="single" w:color="auto" w:sz="4" w:space="0"/>
+            <w:insideH w:val="single" w:color="auto" w:sz="4" w:space="0"/>
+            <w:insideV w:val="single" w:color="auto" w:sz="4" w:space="0"/>
+          </w:tblBorders>
+          <w:tblCellMar>
+            <w:left w:w="108" w:type="dxa"/>
+            <w:right w:w="108" w:type="dxa"/>
+          </w:tblCellMar>
+        </w:tblPrEx>
+        <w:tc>
+          <w:tcPr>
+            <w:tcW w:w="1547" w:type="dxa"/>
+          </w:tcPr>
+          <w:p>
+            <w:pPr>
+              <w:jc w:val="center"/>
+              <w:rPr>
+                <w:rFonts w:hint="default" w:eastAsia="微软雅黑"/>
+                <w:vertAlign w:val="baseline"/>
+                <w:lang w:val="en-US" w:eastAsia="zh-CN"/>
+              </w:rPr>
+            </w:pPr>
+            <w:r>
+              <w:rPr>
+                <w:rFonts w:hint="eastAsia"/>
+                <w:vertAlign w:val="baseline"/>
+                <w:lang w:val="en-US" w:eastAsia="zh-CN"/>
+              </w:rPr>
+              <w:t>V2.0.0</w:t>
+            </w:r>
+          </w:p>
+        </w:tc>
+        <w:tc>
+          <w:tcPr>
+            <w:tcW w:w="1586" w:type="dxa"/>
+          </w:tcPr>
+          <w:p>
+            <w:pPr>
+              <w:jc w:val="center"/>
+              <w:rPr>
+                <w:rFonts w:hint="default" w:eastAsia="微软雅黑"/>
+                <w:vertAlign w:val="baseline"/>
+                <w:lang w:val="en-US" w:eastAsia="zh-CN"/>
+              </w:rPr>
+            </w:pPr>
+            <w:r>
+              <w:rPr>
+                <w:rFonts w:hint="eastAsia"/>
+                <w:vertAlign w:val="baseline"/>
+                <w:lang w:val="en-US" w:eastAsia="zh-CN"/>
+              </w:rPr>
+              <w:t>wq</w:t>
+            </w:r>
+          </w:p>
+        </w:tc>
+        <w:tc>
+          <w:tcPr>
+            <w:tcW w:w="4338" w:type="dxa"/>
+          </w:tcPr>
+          <w:p>
+            <w:pPr>
+              <w:jc w:val="left"/>
+              <w:rPr>
+                <w:rFonts w:hint="default" w:eastAsia="微软雅黑"/>
+                <w:vertAlign w:val="baseline"/>
+                <w:lang w:val="en-US" w:eastAsia="zh-CN"/>
+              </w:rPr>
+            </w:pPr>
+            <w:r>
+              <w:rPr>
+                <w:rFonts w:hint="eastAsia"/>
+                <w:vertAlign w:val="baseline"/>
+                <w:lang w:val="en-US" w:eastAsia="zh-CN"/>
+              </w:rPr>
+              <w:t>新增自动登陆功能</w:t>
+            </w:r>
+          </w:p>
+        </w:tc>
+        <w:tc>
+          <w:tcPr>
+            <w:tcW w:w="2491" w:type="dxa"/>
+          </w:tcPr>
+          <w:p>
+            <w:pPr>
+              <w:jc w:val="center"/>
+              <w:rPr>
+                <w:rFonts w:hint="default" w:eastAsia="微软雅黑"/>
+                <w:vertAlign w:val="baseline"/>
+                <w:lang w:val="en-US" w:eastAsia="zh-CN"/>
+              </w:rPr>
+            </w:pPr>
+            <w:r>
+              <w:rPr>
+                <w:rFonts w:hint="eastAsia"/>
+                <w:vertAlign w:val="baseline"/>
+                <w:lang w:val="en-US" w:eastAsia="zh-CN"/>
+              </w:rPr>
+              <w:t>2026-06-17</w:t>
+            </w:r>
+          </w:p>
+        </w:tc>
+      </w:tr>
+      <w:tr>
+        <w:tblPrEx>
+          <w:tblBorders>
+            <w:top w:val="single" w:color="auto" w:sz="4" w:space="0"/>
+            <w:left w:val="single" w:color="auto" w:sz="4" w:space="0"/>
+            <w:bottom w:val="single" w:color="auto" w:sz="4" w:space="0"/>
+            <w:right w:val="single" w:color="auto" w:sz="4" w:space="0"/>
+            <w:insideH w:val="single" w:color="auto" w:sz="4" w:space="0"/>
+            <w:insideV w:val="single" w:color="auto" w:sz="4" w:space="0"/>
+          </w:tblBorders>
+          <w:tblCellMar>
+            <w:left w:w="108" w:type="dxa"/>
+            <w:right w:w="108" w:type="dxa"/>
+          </w:tblCellMar>
+        </w:tblPrEx>
+        <w:tc>
+          <w:tcPr>
+            <w:tcW w:w="1547" w:type="dxa"/>
+          </w:tcPr>
+          <w:p>
+            <w:pPr>
+              <w:jc w:val="center"/>
+              <w:rPr>
+                <w:rFonts w:hint="default" w:eastAsia="微软雅黑"/>
+                <w:vertAlign w:val="baseline"/>
+                <w:lang w:val="en-US" w:eastAsia="zh-CN"/>
+              </w:rPr>
+            </w:pPr>
+            <w:r>
+              <w:rPr>
+                <w:rFonts w:hint="eastAsia"/>
+                <w:vertAlign w:val="baseline"/>
+                <w:lang w:val="en-US" w:eastAsia="zh-CN"/>
+              </w:rPr>
+              <w:t>V2.1.0</w:t>
+            </w:r>
+          </w:p>
+        </w:tc>
+        <w:tc>
+          <w:tcPr>
+            <w:tcW w:w="1586" w:type="dxa"/>
+          </w:tcPr>
+          <w:p>
+            <w:pPr>
+              <w:jc w:val="center"/>
+              <w:rPr>
+                <w:rFonts w:hint="eastAsia" w:eastAsia="微软雅黑"/>
+                <w:vertAlign w:val="baseline"/>
+                <w:lang w:val="en-US" w:eastAsia="zh-CN"/>
+              </w:rPr>
+            </w:pPr>
+            <w:r>
+              <w:rPr>
+                <w:rFonts w:hint="eastAsia"/>
+                <w:vertAlign w:val="baseline"/>
+                <w:lang w:val="en-US" w:eastAsia="zh-CN"/>
+              </w:rPr>
+              <w:t>wq</w:t>
+            </w:r>
+          </w:p>
+        </w:tc>
+        <w:tc>
+          <w:tcPr>
+            <w:tcW w:w="4338" w:type="dxa"/>
+          </w:tcPr>
+          <w:p>
+            <w:pPr>
+              <w:jc w:val="left"/>
+              <w:rPr>
+                <w:rFonts w:hint="default" w:eastAsia="微软雅黑"/>
+                <w:vertAlign w:val="baseline"/>
+                <w:lang w:val="en-US" w:eastAsia="zh-CN"/>
+              </w:rPr>
+            </w:pPr>
+            <w:r>
+              <w:rPr>
+                <w:rFonts w:hint="eastAsia"/>
+                <w:vertAlign w:val="baseline"/>
+                <w:lang w:val="en-US" w:eastAsia="zh-CN"/>
+              </w:rPr>
+              <w:t>新增自定义工具MVP</w:t>
+            </w:r>
+          </w:p>
+        </w:tc>
+        <w:tc>
+          <w:tcPr>
+            <w:tcW w:w="2491" w:type="dxa"/>
+          </w:tcPr>
+          <w:p>
+            <w:pPr>
+              <w:jc w:val="center"/>
+              <w:rPr>
+                <w:rFonts w:hint="default" w:eastAsia="微软雅黑"/>
+                <w:vertAlign w:val="baseline"/>
+                <w:lang w:val="en-US" w:eastAsia="zh-CN"/>
+              </w:rPr>
+            </w:pPr>
+            <w:r>
+              <w:rPr>
+                <w:rFonts w:hint="eastAsia"/>
+                <w:vertAlign w:val="baseline"/>
+                <w:lang w:val="en-US" w:eastAsia="zh-CN"/>
+              </w:rPr>
+              <w:t>2026-06-29</w:t>
+            </w:r>
+          </w:p>
+        </w:tc>
+      </w:tr>
+    </w:tbl>
     <w:p/>
     <w:p/>
     <w:p>
@@ -85,7 +647,7 @@
       <w:pPr>
         <w:pStyle w:val="2"/>
       </w:pPr>
-      <w:bookmarkStart w:id="0" w:name="_Toc3119"/>
+      <w:bookmarkStart w:id="0" w:name="_Toc3342"/>
       <w:r>
         <w:t>目录</w:t>
       </w:r>
@@ -134,8 +696,8 @@
               <w:tab w:val="right" w:leader="dot" w:pos="9746"/>
             </w:tabs>
           </w:pPr>
-          <w:bookmarkStart w:id="69" w:name="_GoBack"/>
-          <w:bookmarkEnd w:id="69"/>
+          <w:bookmarkStart w:id="71" w:name="_GoBack"/>
+          <w:bookmarkEnd w:id="71"/>
           <w:r>
             <w:fldChar w:fldCharType="begin"/>
           </w:r>
@@ -149,7 +711,7 @@
             <w:fldChar w:fldCharType="begin"/>
           </w:r>
           <w:r>
-            <w:instrText xml:space="preserve"> HYPERLINK \l _Toc3119 </w:instrText>
+            <w:instrText xml:space="preserve"> HYPERLINK \l _Toc3342 </w:instrText>
           </w:r>
           <w:r>
             <w:fldChar w:fldCharType="separate"/>
@@ -164,7 +726,7 @@
             <w:fldChar w:fldCharType="begin"/>
           </w:r>
           <w:r>
-            <w:instrText xml:space="preserve"> PAGEREF _Toc3119 \h </w:instrText>
+            <w:instrText xml:space="preserve"> PAGEREF _Toc3342 \h </w:instrText>
           </w:r>
           <w:r>
             <w:fldChar w:fldCharType="separate"/>
@@ -190,7 +752,7 @@
             <w:fldChar w:fldCharType="begin"/>
           </w:r>
           <w:r>
-            <w:instrText xml:space="preserve"> HYPERLINK \l _Toc4592 </w:instrText>
+            <w:instrText xml:space="preserve"> HYPERLINK \l _Toc14500 </w:instrText>
           </w:r>
           <w:r>
             <w:fldChar w:fldCharType="separate"/>
@@ -205,7 +767,7 @@
             <w:fldChar w:fldCharType="begin"/>
           </w:r>
           <w:r>
-            <w:instrText xml:space="preserve"> PAGEREF _Toc4592 \h </w:instrText>
+            <w:instrText xml:space="preserve"> PAGEREF _Toc14500 \h </w:instrText>
           </w:r>
           <w:r>
             <w:fldChar w:fldCharType="separate"/>
@@ -231,7 +793,7 @@
             <w:fldChar w:fldCharType="begin"/>
           </w:r>
           <w:r>
-            <w:instrText xml:space="preserve"> HYPERLINK \l _Toc7652 </w:instrText>
+            <w:instrText xml:space="preserve"> HYPERLINK \l _Toc26843 </w:instrText>
           </w:r>
           <w:r>
             <w:fldChar w:fldCharType="separate"/>
@@ -246,7 +808,7 @@
             <w:fldChar w:fldCharType="begin"/>
           </w:r>
           <w:r>
-            <w:instrText xml:space="preserve"> PAGEREF _Toc7652 \h </w:instrText>
+            <w:instrText xml:space="preserve"> PAGEREF _Toc26843 \h </w:instrText>
           </w:r>
           <w:r>
             <w:fldChar w:fldCharType="separate"/>
@@ -272,7 +834,7 @@
             <w:fldChar w:fldCharType="begin"/>
           </w:r>
           <w:r>
-            <w:instrText xml:space="preserve"> HYPERLINK \l _Toc11282 </w:instrText>
+            <w:instrText xml:space="preserve"> HYPERLINK \l _Toc7356 </w:instrText>
           </w:r>
           <w:r>
             <w:fldChar w:fldCharType="separate"/>
@@ -287,7 +849,7 @@
             <w:fldChar w:fldCharType="begin"/>
           </w:r>
           <w:r>
-            <w:instrText xml:space="preserve"> PAGEREF _Toc11282 \h </w:instrText>
+            <w:instrText xml:space="preserve"> PAGEREF _Toc7356 \h </w:instrText>
           </w:r>
           <w:r>
             <w:fldChar w:fldCharType="separate"/>
@@ -313,7 +875,7 @@
             <w:fldChar w:fldCharType="begin"/>
           </w:r>
           <w:r>
-            <w:instrText xml:space="preserve"> HYPERLINK \l _Toc3669 </w:instrText>
+            <w:instrText xml:space="preserve"> HYPERLINK \l _Toc23352 </w:instrText>
           </w:r>
           <w:r>
             <w:fldChar w:fldCharType="separate"/>
@@ -328,7 +890,7 @@
             <w:fldChar w:fldCharType="begin"/>
           </w:r>
           <w:r>
-            <w:instrText xml:space="preserve"> PAGEREF _Toc3669 \h </w:instrText>
+            <w:instrText xml:space="preserve"> PAGEREF _Toc23352 \h </w:instrText>
           </w:r>
           <w:r>
             <w:fldChar w:fldCharType="separate"/>
@@ -354,7 +916,7 @@
             <w:fldChar w:fldCharType="begin"/>
           </w:r>
           <w:r>
-            <w:instrText xml:space="preserve"> HYPERLINK \l _Toc6233 </w:instrText>
+            <w:instrText xml:space="preserve"> HYPERLINK \l _Toc23132 </w:instrText>
           </w:r>
           <w:r>
             <w:fldChar w:fldCharType="separate"/>
@@ -369,7 +931,7 @@
             <w:fldChar w:fldCharType="begin"/>
           </w:r>
           <w:r>
-            <w:instrText xml:space="preserve"> PAGEREF _Toc6233 \h </w:instrText>
+            <w:instrText xml:space="preserve"> PAGEREF _Toc23132 \h </w:instrText>
           </w:r>
           <w:r>
             <w:fldChar w:fldCharType="separate"/>
@@ -395,7 +957,7 @@
             <w:fldChar w:fldCharType="begin"/>
           </w:r>
           <w:r>
-            <w:instrText xml:space="preserve"> HYPERLINK \l _Toc8793 </w:instrText>
+            <w:instrText xml:space="preserve"> HYPERLINK \l _Toc4697 </w:instrText>
           </w:r>
           <w:r>
             <w:fldChar w:fldCharType="separate"/>
@@ -410,7 +972,7 @@
             <w:fldChar w:fldCharType="begin"/>
           </w:r>
           <w:r>
-            <w:instrText xml:space="preserve"> PAGEREF _Toc8793 \h </w:instrText>
+            <w:instrText xml:space="preserve"> PAGEREF _Toc4697 \h </w:instrText>
           </w:r>
           <w:r>
             <w:fldChar w:fldCharType="separate"/>
@@ -436,7 +998,7 @@
             <w:fldChar w:fldCharType="begin"/>
           </w:r>
           <w:r>
-            <w:instrText xml:space="preserve"> HYPERLINK \l _Toc7394 </w:instrText>
+            <w:instrText xml:space="preserve"> HYPERLINK \l _Toc23190 </w:instrText>
           </w:r>
           <w:r>
             <w:fldChar w:fldCharType="separate"/>
@@ -451,7 +1013,7 @@
             <w:fldChar w:fldCharType="begin"/>
           </w:r>
           <w:r>
-            <w:instrText xml:space="preserve"> PAGEREF _Toc7394 \h </w:instrText>
+            <w:instrText xml:space="preserve"> PAGEREF _Toc23190 \h </w:instrText>
           </w:r>
           <w:r>
             <w:fldChar w:fldCharType="separate"/>
@@ -477,7 +1039,7 @@
             <w:fldChar w:fldCharType="begin"/>
           </w:r>
           <w:r>
-            <w:instrText xml:space="preserve"> HYPERLINK \l _Toc29080 </w:instrText>
+            <w:instrText xml:space="preserve"> HYPERLINK \l _Toc16370 </w:instrText>
           </w:r>
           <w:r>
             <w:fldChar w:fldCharType="separate"/>
@@ -492,7 +1054,7 @@
             <w:fldChar w:fldCharType="begin"/>
           </w:r>
           <w:r>
-            <w:instrText xml:space="preserve"> PAGEREF _Toc29080 \h </w:instrText>
+            <w:instrText xml:space="preserve"> PAGEREF _Toc16370 \h </w:instrText>
           </w:r>
           <w:r>
             <w:fldChar w:fldCharType="separate"/>
@@ -518,7 +1080,7 @@
             <w:fldChar w:fldCharType="begin"/>
           </w:r>
           <w:r>
-            <w:instrText xml:space="preserve"> HYPERLINK \l _Toc15541 </w:instrText>
+            <w:instrText xml:space="preserve"> HYPERLINK \l _Toc27027 </w:instrText>
           </w:r>
           <w:r>
             <w:fldChar w:fldCharType="separate"/>
@@ -533,7 +1095,7 @@
             <w:fldChar w:fldCharType="begin"/>
           </w:r>
           <w:r>
-            <w:instrText xml:space="preserve"> PAGEREF _Toc15541 \h </w:instrText>
+            <w:instrText xml:space="preserve"> PAGEREF _Toc27027 \h </w:instrText>
           </w:r>
           <w:r>
             <w:fldChar w:fldCharType="separate"/>
@@ -559,7 +1121,7 @@
             <w:fldChar w:fldCharType="begin"/>
           </w:r>
           <w:r>
-            <w:instrText xml:space="preserve"> HYPERLINK \l _Toc32014 </w:instrText>
+            <w:instrText xml:space="preserve"> HYPERLINK \l _Toc25541 </w:instrText>
           </w:r>
           <w:r>
             <w:fldChar w:fldCharType="separate"/>
@@ -581,7 +1143,7 @@
             <w:fldChar w:fldCharType="begin"/>
           </w:r>
           <w:r>
-            <w:instrText xml:space="preserve"> PAGEREF _Toc32014 \h </w:instrText>
+            <w:instrText xml:space="preserve"> PAGEREF _Toc25541 \h </w:instrText>
           </w:r>
           <w:r>
             <w:fldChar w:fldCharType="separate"/>
@@ -607,7 +1169,7 @@
             <w:fldChar w:fldCharType="begin"/>
           </w:r>
           <w:r>
-            <w:instrText xml:space="preserve"> HYPERLINK \l _Toc7848 </w:instrText>
+            <w:instrText xml:space="preserve"> HYPERLINK \l _Toc17244 </w:instrText>
           </w:r>
           <w:r>
             <w:fldChar w:fldCharType="separate"/>
@@ -629,7 +1191,7 @@
             <w:fldChar w:fldCharType="begin"/>
           </w:r>
           <w:r>
-            <w:instrText xml:space="preserve"> PAGEREF _Toc7848 \h </w:instrText>
+            <w:instrText xml:space="preserve"> PAGEREF _Toc17244 \h </w:instrText>
           </w:r>
           <w:r>
             <w:fldChar w:fldCharType="separate"/>
@@ -655,7 +1217,7 @@
             <w:fldChar w:fldCharType="begin"/>
           </w:r>
           <w:r>
-            <w:instrText xml:space="preserve"> HYPERLINK \l _Toc31449 </w:instrText>
+            <w:instrText xml:space="preserve"> HYPERLINK \l _Toc24512 </w:instrText>
           </w:r>
           <w:r>
             <w:fldChar w:fldCharType="separate"/>
@@ -677,7 +1239,7 @@
             <w:fldChar w:fldCharType="begin"/>
           </w:r>
           <w:r>
-            <w:instrText xml:space="preserve"> PAGEREF _Toc31449 \h </w:instrText>
+            <w:instrText xml:space="preserve"> PAGEREF _Toc24512 \h </w:instrText>
           </w:r>
           <w:r>
             <w:fldChar w:fldCharType="separate"/>
@@ -703,7 +1265,7 @@
             <w:fldChar w:fldCharType="begin"/>
           </w:r>
           <w:r>
-            <w:instrText xml:space="preserve"> HYPERLINK \l _Toc10360 </w:instrText>
+            <w:instrText xml:space="preserve"> HYPERLINK \l _Toc10254 </w:instrText>
           </w:r>
           <w:r>
             <w:fldChar w:fldCharType="separate"/>
@@ -718,7 +1280,7 @@
             <w:fldChar w:fldCharType="begin"/>
           </w:r>
           <w:r>
-            <w:instrText xml:space="preserve"> PAGEREF _Toc10360 \h </w:instrText>
+            <w:instrText xml:space="preserve"> PAGEREF _Toc10254 \h </w:instrText>
           </w:r>
           <w:r>
             <w:fldChar w:fldCharType="separate"/>
@@ -744,7 +1306,7 @@
             <w:fldChar w:fldCharType="begin"/>
           </w:r>
           <w:r>
-            <w:instrText xml:space="preserve"> HYPERLINK \l _Toc2423 </w:instrText>
+            <w:instrText xml:space="preserve"> HYPERLINK \l _Toc18914 </w:instrText>
           </w:r>
           <w:r>
             <w:fldChar w:fldCharType="separate"/>
@@ -766,7 +1328,7 @@
             <w:fldChar w:fldCharType="begin"/>
           </w:r>
           <w:r>
-            <w:instrText xml:space="preserve"> PAGEREF _Toc2423 \h </w:instrText>
+            <w:instrText xml:space="preserve"> PAGEREF _Toc18914 \h </w:instrText>
           </w:r>
           <w:r>
             <w:fldChar w:fldCharType="separate"/>
@@ -792,7 +1354,7 @@
             <w:fldChar w:fldCharType="begin"/>
           </w:r>
           <w:r>
-            <w:instrText xml:space="preserve"> HYPERLINK \l _Toc22423 </w:instrText>
+            <w:instrText xml:space="preserve"> HYPERLINK \l _Toc15003 </w:instrText>
           </w:r>
           <w:r>
             <w:fldChar w:fldCharType="separate"/>
@@ -807,7 +1369,7 @@
             <w:fldChar w:fldCharType="begin"/>
           </w:r>
           <w:r>
-            <w:instrText xml:space="preserve"> PAGEREF _Toc22423 \h </w:instrText>
+            <w:instrText xml:space="preserve"> PAGEREF _Toc15003 \h </w:instrText>
           </w:r>
           <w:r>
             <w:fldChar w:fldCharType="separate"/>
@@ -833,7 +1395,7 @@
             <w:fldChar w:fldCharType="begin"/>
           </w:r>
           <w:r>
-            <w:instrText xml:space="preserve"> HYPERLINK \l _Toc19922 </w:instrText>
+            <w:instrText xml:space="preserve"> HYPERLINK \l _Toc21124 </w:instrText>
           </w:r>
           <w:r>
             <w:fldChar w:fldCharType="separate"/>
@@ -848,7 +1410,7 @@
             <w:fldChar w:fldCharType="begin"/>
           </w:r>
           <w:r>
-            <w:instrText xml:space="preserve"> PAGEREF _Toc19922 \h </w:instrText>
+            <w:instrText xml:space="preserve"> PAGEREF _Toc21124 \h </w:instrText>
           </w:r>
           <w:r>
             <w:fldChar w:fldCharType="separate"/>
@@ -874,7 +1436,7 @@
             <w:fldChar w:fldCharType="begin"/>
           </w:r>
           <w:r>
-            <w:instrText xml:space="preserve"> HYPERLINK \l _Toc28030 </w:instrText>
+            <w:instrText xml:space="preserve"> HYPERLINK \l _Toc18041 </w:instrText>
           </w:r>
           <w:r>
             <w:fldChar w:fldCharType="separate"/>
@@ -889,7 +1451,7 @@
             <w:fldChar w:fldCharType="begin"/>
           </w:r>
           <w:r>
-            <w:instrText xml:space="preserve"> PAGEREF _Toc28030 \h </w:instrText>
+            <w:instrText xml:space="preserve"> PAGEREF _Toc18041 \h </w:instrText>
           </w:r>
           <w:r>
             <w:fldChar w:fldCharType="separate"/>
@@ -915,7 +1477,7 @@
             <w:fldChar w:fldCharType="begin"/>
           </w:r>
           <w:r>
-            <w:instrText xml:space="preserve"> HYPERLINK \l _Toc23248 </w:instrText>
+            <w:instrText xml:space="preserve"> HYPERLINK \l _Toc2494 </w:instrText>
           </w:r>
           <w:r>
             <w:fldChar w:fldCharType="separate"/>
@@ -930,7 +1492,7 @@
             <w:fldChar w:fldCharType="begin"/>
           </w:r>
           <w:r>
-            <w:instrText xml:space="preserve"> PAGEREF _Toc23248 \h </w:instrText>
+            <w:instrText xml:space="preserve"> PAGEREF _Toc2494 \h </w:instrText>
           </w:r>
           <w:r>
             <w:fldChar w:fldCharType="separate"/>
@@ -956,7 +1518,7 @@
             <w:fldChar w:fldCharType="begin"/>
           </w:r>
           <w:r>
-            <w:instrText xml:space="preserve"> HYPERLINK \l _Toc29577 </w:instrText>
+            <w:instrText xml:space="preserve"> HYPERLINK \l _Toc11252 </w:instrText>
           </w:r>
           <w:r>
             <w:fldChar w:fldCharType="separate"/>
@@ -975,7 +1537,7 @@
             <w:fldChar w:fldCharType="begin"/>
           </w:r>
           <w:r>
-            <w:instrText xml:space="preserve"> PAGEREF _Toc29577 \h </w:instrText>
+            <w:instrText xml:space="preserve"> PAGEREF _Toc11252 \h </w:instrText>
           </w:r>
           <w:r>
             <w:fldChar w:fldCharType="separate"/>
@@ -1001,7 +1563,7 @@
             <w:fldChar w:fldCharType="begin"/>
           </w:r>
           <w:r>
-            <w:instrText xml:space="preserve"> HYPERLINK \l _Toc30273 </w:instrText>
+            <w:instrText xml:space="preserve"> HYPERLINK \l _Toc25842 </w:instrText>
           </w:r>
           <w:r>
             <w:fldChar w:fldCharType="separate"/>
@@ -1020,7 +1582,7 @@
             <w:fldChar w:fldCharType="begin"/>
           </w:r>
           <w:r>
-            <w:instrText xml:space="preserve"> PAGEREF _Toc30273 \h </w:instrText>
+            <w:instrText xml:space="preserve"> PAGEREF _Toc25842 \h </w:instrText>
           </w:r>
           <w:r>
             <w:fldChar w:fldCharType="separate"/>
@@ -1046,7 +1608,7 @@
             <w:fldChar w:fldCharType="begin"/>
           </w:r>
           <w:r>
-            <w:instrText xml:space="preserve"> HYPERLINK \l _Toc31391 </w:instrText>
+            <w:instrText xml:space="preserve"> HYPERLINK \l _Toc28678 </w:instrText>
           </w:r>
           <w:r>
             <w:fldChar w:fldCharType="separate"/>
@@ -1078,7 +1640,7 @@
             <w:fldChar w:fldCharType="begin"/>
           </w:r>
           <w:r>
-            <w:instrText xml:space="preserve"> PAGEREF _Toc31391 \h </w:instrText>
+            <w:instrText xml:space="preserve"> PAGEREF _Toc28678 \h </w:instrText>
           </w:r>
           <w:r>
             <w:fldChar w:fldCharType="separate"/>
@@ -1104,7 +1666,7 @@
             <w:fldChar w:fldCharType="begin"/>
           </w:r>
           <w:r>
-            <w:instrText xml:space="preserve"> HYPERLINK \l _Toc11873 </w:instrText>
+            <w:instrText xml:space="preserve"> HYPERLINK \l _Toc11727 </w:instrText>
           </w:r>
           <w:r>
             <w:fldChar w:fldCharType="separate"/>
@@ -1136,7 +1698,7 @@
             <w:fldChar w:fldCharType="begin"/>
           </w:r>
           <w:r>
-            <w:instrText xml:space="preserve"> PAGEREF _Toc11873 \h </w:instrText>
+            <w:instrText xml:space="preserve"> PAGEREF _Toc11727 \h </w:instrText>
           </w:r>
           <w:r>
             <w:fldChar w:fldCharType="separate"/>
@@ -1162,7 +1724,7 @@
             <w:fldChar w:fldCharType="begin"/>
           </w:r>
           <w:r>
-            <w:instrText xml:space="preserve"> HYPERLINK \l _Toc23865 </w:instrText>
+            <w:instrText xml:space="preserve"> HYPERLINK \l _Toc5079 </w:instrText>
           </w:r>
           <w:r>
             <w:fldChar w:fldCharType="separate"/>
@@ -1194,7 +1756,7 @@
             <w:fldChar w:fldCharType="begin"/>
           </w:r>
           <w:r>
-            <w:instrText xml:space="preserve"> PAGEREF _Toc23865 \h </w:instrText>
+            <w:instrText xml:space="preserve"> PAGEREF _Toc5079 \h </w:instrText>
           </w:r>
           <w:r>
             <w:fldChar w:fldCharType="separate"/>
@@ -1220,7 +1782,7 @@
             <w:fldChar w:fldCharType="begin"/>
           </w:r>
           <w:r>
-            <w:instrText xml:space="preserve"> HYPERLINK \l _Toc3145 </w:instrText>
+            <w:instrText xml:space="preserve"> HYPERLINK \l _Toc3653 </w:instrText>
           </w:r>
           <w:r>
             <w:fldChar w:fldCharType="separate"/>
@@ -1233,7 +1795,55 @@
               <w:rFonts w:hint="eastAsia"/>
               <w:lang w:val="en-US" w:eastAsia="zh-CN"/>
             </w:rPr>
-            <w:t>11</w:t>
+            <w:t>12自定义工具</w:t>
+          </w:r>
+          <w:r>
+            <w:tab/>
+          </w:r>
+          <w:r>
+            <w:fldChar w:fldCharType="begin"/>
+          </w:r>
+          <w:r>
+            <w:instrText xml:space="preserve"> PAGEREF _Toc3653 \h </w:instrText>
+          </w:r>
+          <w:r>
+            <w:fldChar w:fldCharType="separate"/>
+          </w:r>
+          <w:r>
+            <w:t>22</w:t>
+          </w:r>
+          <w:r>
+            <w:fldChar w:fldCharType="end"/>
+          </w:r>
+          <w:r>
+            <w:fldChar w:fldCharType="end"/>
+          </w:r>
+        </w:p>
+        <w:p>
+          <w:pPr>
+            <w:pStyle w:val="11"/>
+            <w:tabs>
+              <w:tab w:val="right" w:leader="dot" w:pos="9746"/>
+            </w:tabs>
+          </w:pPr>
+          <w:r>
+            <w:fldChar w:fldCharType="begin"/>
+          </w:r>
+          <w:r>
+            <w:instrText xml:space="preserve"> HYPERLINK \l _Toc14679 </w:instrText>
+          </w:r>
+          <w:r>
+            <w:fldChar w:fldCharType="separate"/>
+          </w:r>
+          <w:r>
+            <w:t>4.</w:t>
+          </w:r>
+          <w:r>
+            <w:rPr>
+              <w:rFonts w:hint="eastAsia"/>
+              <w:lang w:val="en-US" w:eastAsia="zh-CN"/>
+            </w:rPr>
+            <w:t>13</w:t>
           </w:r>
           <w:r>
             <w:t>工具扩展</w:t>
@@ -1245,13 +1855,13 @@
             <w:fldChar w:fldCharType="begin"/>
           </w:r>
           <w:r>
-            <w:instrText xml:space="preserve"> PAGEREF _Toc3145 \h </w:instrText>
-          </w:r>
-          <w:r>
-            <w:fldChar w:fldCharType="separate"/>
-          </w:r>
-          <w:r>
-            <w:t>22</w:t>
+            <w:instrText xml:space="preserve"> PAGEREF _Toc14679 \h </w:instrText>
+          </w:r>
+          <w:r>
+            <w:fldChar w:fldCharType="separate"/>
+          </w:r>
+          <w:r>
+            <w:t>23</w:t>
           </w:r>
           <w:r>
             <w:fldChar w:fldCharType="end"/>
@@ -1271,7 +1881,7 @@
             <w:fldChar w:fldCharType="begin"/>
           </w:r>
           <w:r>
-            <w:instrText xml:space="preserve"> HYPERLINK \l _Toc16004 </w:instrText>
+            <w:instrText xml:space="preserve"> HYPERLINK \l _Toc18753 </w:instrText>
           </w:r>
           <w:r>
             <w:fldChar w:fldCharType="separate"/>
@@ -1293,13 +1903,13 @@
             <w:fldChar w:fldCharType="begin"/>
           </w:r>
           <w:r>
-            <w:instrText xml:space="preserve"> PAGEREF _Toc16004 \h </w:instrText>
-          </w:r>
-          <w:r>
-            <w:fldChar w:fldCharType="separate"/>
-          </w:r>
-          <w:r>
-            <w:t>23</w:t>
+            <w:instrText xml:space="preserve"> PAGEREF _Toc18753 \h </w:instrText>
+          </w:r>
+          <w:r>
+            <w:fldChar w:fldCharType="separate"/>
+          </w:r>
+          <w:r>
+            <w:t>25</w:t>
           </w:r>
           <w:r>
             <w:fldChar w:fldCharType="end"/>
@@ -1319,7 +1929,7 @@
             <w:fldChar w:fldCharType="begin"/>
           </w:r>
           <w:r>
-            <w:instrText xml:space="preserve"> HYPERLINK \l _Toc21249 </w:instrText>
+            <w:instrText xml:space="preserve"> HYPERLINK \l _Toc1423 </w:instrText>
           </w:r>
           <w:r>
             <w:fldChar w:fldCharType="separate"/>
@@ -1341,13 +1951,13 @@
             <w:fldChar w:fldCharType="begin"/>
           </w:r>
           <w:r>
-            <w:instrText xml:space="preserve"> PAGEREF _Toc21249 \h </w:instrText>
-          </w:r>
-          <w:r>
-            <w:fldChar w:fldCharType="separate"/>
-          </w:r>
-          <w:r>
-            <w:t>23</w:t>
+            <w:instrText xml:space="preserve"> PAGEREF _Toc1423 \h </w:instrText>
+          </w:r>
+          <w:r>
+            <w:fldChar w:fldCharType="separate"/>
+          </w:r>
+          <w:r>
+            <w:t>25</w:t>
           </w:r>
           <w:r>
             <w:fldChar w:fldCharType="end"/>
@@ -1367,7 +1977,7 @@
             <w:fldChar w:fldCharType="begin"/>
           </w:r>
           <w:r>
-            <w:instrText xml:space="preserve"> HYPERLINK \l _Toc6066 </w:instrText>
+            <w:instrText xml:space="preserve"> HYPERLINK \l _Toc28208 </w:instrText>
           </w:r>
           <w:r>
             <w:fldChar w:fldCharType="separate"/>
@@ -1389,13 +1999,13 @@
             <w:fldChar w:fldCharType="begin"/>
           </w:r>
           <w:r>
-            <w:instrText xml:space="preserve"> PAGEREF _Toc6066 \h </w:instrText>
-          </w:r>
-          <w:r>
-            <w:fldChar w:fldCharType="separate"/>
-          </w:r>
-          <w:r>
-            <w:t>23</w:t>
+            <w:instrText xml:space="preserve"> PAGEREF _Toc28208 \h </w:instrText>
+          </w:r>
+          <w:r>
+            <w:fldChar w:fldCharType="separate"/>
+          </w:r>
+          <w:r>
+            <w:t>25</w:t>
           </w:r>
           <w:r>
             <w:fldChar w:fldCharType="end"/>
@@ -1415,7 +2025,7 @@
             <w:fldChar w:fldCharType="begin"/>
           </w:r>
           <w:r>
-            <w:instrText xml:space="preserve"> HYPERLINK \l _Toc30741 </w:instrText>
+            <w:instrText xml:space="preserve"> HYPERLINK \l _Toc30366 </w:instrText>
           </w:r>
           <w:r>
             <w:fldChar w:fldCharType="separate"/>
@@ -1437,13 +2047,13 @@
             <w:fldChar w:fldCharType="begin"/>
           </w:r>
           <w:r>
-            <w:instrText xml:space="preserve"> PAGEREF _Toc30741 \h </w:instrText>
-          </w:r>
-          <w:r>
-            <w:fldChar w:fldCharType="separate"/>
-          </w:r>
-          <w:r>
-            <w:t>23</w:t>
+            <w:instrText xml:space="preserve"> PAGEREF _Toc30366 \h </w:instrText>
+          </w:r>
+          <w:r>
+            <w:fldChar w:fldCharType="separate"/>
+          </w:r>
+          <w:r>
+            <w:t>25</w:t>
           </w:r>
           <w:r>
             <w:fldChar w:fldCharType="end"/>
@@ -1463,7 +2073,7 @@
             <w:fldChar w:fldCharType="begin"/>
           </w:r>
           <w:r>
-            <w:instrText xml:space="preserve"> HYPERLINK \l _Toc27832 </w:instrText>
+            <w:instrText xml:space="preserve"> HYPERLINK \l _Toc21119 </w:instrText>
           </w:r>
           <w:r>
             <w:fldChar w:fldCharType="separate"/>
@@ -1485,13 +2095,13 @@
             <w:fldChar w:fldCharType="begin"/>
           </w:r>
           <w:r>
-            <w:instrText xml:space="preserve"> PAGEREF _Toc27832 \h </w:instrText>
-          </w:r>
-          <w:r>
-            <w:fldChar w:fldCharType="separate"/>
-          </w:r>
-          <w:r>
-            <w:t>23</w:t>
+            <w:instrText xml:space="preserve"> PAGEREF _Toc21119 \h </w:instrText>
+          </w:r>
+          <w:r>
+            <w:fldChar w:fldCharType="separate"/>
+          </w:r>
+          <w:r>
+            <w:t>25</w:t>
           </w:r>
           <w:r>
             <w:fldChar w:fldCharType="end"/>
@@ -1511,7 +2121,7 @@
             <w:fldChar w:fldCharType="begin"/>
           </w:r>
           <w:r>
-            <w:instrText xml:space="preserve"> HYPERLINK \l _Toc10713 </w:instrText>
+            <w:instrText xml:space="preserve"> HYPERLINK \l _Toc26392 </w:instrText>
           </w:r>
           <w:r>
             <w:fldChar w:fldCharType="separate"/>
@@ -1533,13 +2143,13 @@
             <w:fldChar w:fldCharType="begin"/>
           </w:r>
           <w:r>
-            <w:instrText xml:space="preserve"> PAGEREF _Toc10713 \h </w:instrText>
-          </w:r>
-          <w:r>
-            <w:fldChar w:fldCharType="separate"/>
-          </w:r>
-          <w:r>
-            <w:t>23</w:t>
+            <w:instrText xml:space="preserve"> PAGEREF _Toc26392 \h </w:instrText>
+          </w:r>
+          <w:r>
+            <w:fldChar w:fldCharType="separate"/>
+          </w:r>
+          <w:r>
+            <w:t>25</w:t>
           </w:r>
           <w:r>
             <w:fldChar w:fldCharType="end"/>
@@ -1559,7 +2169,7 @@
             <w:fldChar w:fldCharType="begin"/>
           </w:r>
           <w:r>
-            <w:instrText xml:space="preserve"> HYPERLINK \l _Toc19463 </w:instrText>
+            <w:instrText xml:space="preserve"> HYPERLINK \l _Toc15619 </w:instrText>
           </w:r>
           <w:r>
             <w:fldChar w:fldCharType="separate"/>
@@ -1581,13 +2191,13 @@
             <w:fldChar w:fldCharType="begin"/>
           </w:r>
           <w:r>
-            <w:instrText xml:space="preserve"> PAGEREF _Toc19463 \h </w:instrText>
-          </w:r>
-          <w:r>
-            <w:fldChar w:fldCharType="separate"/>
-          </w:r>
-          <w:r>
-            <w:t>23</w:t>
+            <w:instrText xml:space="preserve"> PAGEREF _Toc15619 \h </w:instrText>
+          </w:r>
+          <w:r>
+            <w:fldChar w:fldCharType="separate"/>
+          </w:r>
+          <w:r>
+            <w:t>25</w:t>
           </w:r>
           <w:r>
             <w:fldChar w:fldCharType="end"/>
@@ -1607,7 +2217,7 @@
             <w:fldChar w:fldCharType="begin"/>
           </w:r>
           <w:r>
-            <w:instrText xml:space="preserve"> HYPERLINK \l _Toc6334 </w:instrText>
+            <w:instrText xml:space="preserve"> HYPERLINK \l _Toc11857 </w:instrText>
           </w:r>
           <w:r>
             <w:fldChar w:fldCharType="separate"/>
@@ -1646,13 +2256,13 @@
             <w:fldChar w:fldCharType="begin"/>
           </w:r>
           <w:r>
-            <w:instrText xml:space="preserve"> PAGEREF _Toc6334 \h </w:instrText>
-          </w:r>
-          <w:r>
-            <w:fldChar w:fldCharType="separate"/>
-          </w:r>
-          <w:r>
-            <w:t>23</w:t>
+            <w:instrText xml:space="preserve"> PAGEREF _Toc11857 \h </w:instrText>
+          </w:r>
+          <w:r>
+            <w:fldChar w:fldCharType="separate"/>
+          </w:r>
+          <w:r>
+            <w:t>25</w:t>
           </w:r>
           <w:r>
             <w:fldChar w:fldCharType="end"/>
@@ -1672,7 +2282,7 @@
             <w:fldChar w:fldCharType="begin"/>
           </w:r>
           <w:r>
-            <w:instrText xml:space="preserve"> HYPERLINK \l _Toc6402 </w:instrText>
+            <w:instrText xml:space="preserve"> HYPERLINK \l _Toc13995 </w:instrText>
           </w:r>
           <w:r>
             <w:fldChar w:fldCharType="separate"/>
@@ -1694,13 +2304,13 @@
             <w:fldChar w:fldCharType="begin"/>
           </w:r>
           <w:r>
-            <w:instrText xml:space="preserve"> PAGEREF _Toc6402 \h </w:instrText>
-          </w:r>
-          <w:r>
-            <w:fldChar w:fldCharType="separate"/>
-          </w:r>
-          <w:r>
-            <w:t>24</w:t>
+            <w:instrText xml:space="preserve"> PAGEREF _Toc13995 \h </w:instrText>
+          </w:r>
+          <w:r>
+            <w:fldChar w:fldCharType="separate"/>
+          </w:r>
+          <w:r>
+            <w:t>26</w:t>
           </w:r>
           <w:r>
             <w:fldChar w:fldCharType="end"/>
@@ -1720,7 +2330,7 @@
             <w:fldChar w:fldCharType="begin"/>
           </w:r>
           <w:r>
-            <w:instrText xml:space="preserve"> HYPERLINK \l _Toc9322 </w:instrText>
+            <w:instrText xml:space="preserve"> HYPERLINK \l _Toc10368 </w:instrText>
           </w:r>
           <w:r>
             <w:fldChar w:fldCharType="separate"/>
@@ -1742,13 +2352,13 @@
             <w:fldChar w:fldCharType="begin"/>
           </w:r>
           <w:r>
-            <w:instrText xml:space="preserve"> PAGEREF _Toc9322 \h </w:instrText>
-          </w:r>
-          <w:r>
-            <w:fldChar w:fldCharType="separate"/>
-          </w:r>
-          <w:r>
-            <w:t>24</w:t>
+            <w:instrText xml:space="preserve"> PAGEREF _Toc10368 \h </w:instrText>
+          </w:r>
+          <w:r>
+            <w:fldChar w:fldCharType="separate"/>
+          </w:r>
+          <w:r>
+            <w:t>26</w:t>
           </w:r>
           <w:r>
             <w:fldChar w:fldCharType="end"/>
@@ -1768,7 +2378,7 @@
             <w:fldChar w:fldCharType="begin"/>
           </w:r>
           <w:r>
-            <w:instrText xml:space="preserve"> HYPERLINK \l _Toc24389 </w:instrText>
+            <w:instrText xml:space="preserve"> HYPERLINK \l _Toc4934 </w:instrText>
           </w:r>
           <w:r>
             <w:fldChar w:fldCharType="separate"/>
@@ -1790,13 +2400,13 @@
             <w:fldChar w:fldCharType="begin"/>
           </w:r>
           <w:r>
-            <w:instrText xml:space="preserve"> PAGEREF _Toc24389 \h </w:instrText>
-          </w:r>
-          <w:r>
-            <w:fldChar w:fldCharType="separate"/>
-          </w:r>
-          <w:r>
-            <w:t>24</w:t>
+            <w:instrText xml:space="preserve"> PAGEREF _Toc4934 \h </w:instrText>
+          </w:r>
+          <w:r>
+            <w:fldChar w:fldCharType="separate"/>
+          </w:r>
+          <w:r>
+            <w:t>26</w:t>
           </w:r>
           <w:r>
             <w:fldChar w:fldCharType="end"/>
@@ -1816,7 +2426,7 @@
             <w:fldChar w:fldCharType="begin"/>
           </w:r>
           <w:r>
-            <w:instrText xml:space="preserve"> HYPERLINK \l _Toc21103 </w:instrText>
+            <w:instrText xml:space="preserve"> HYPERLINK \l _Toc12117 </w:instrText>
           </w:r>
           <w:r>
             <w:fldChar w:fldCharType="separate"/>
@@ -1838,13 +2448,13 @@
             <w:fldChar w:fldCharType="begin"/>
           </w:r>
           <w:r>
-            <w:instrText xml:space="preserve"> PAGEREF _Toc21103 \h </w:instrText>
-          </w:r>
-          <w:r>
-            <w:fldChar w:fldCharType="separate"/>
-          </w:r>
-          <w:r>
-            <w:t>24</w:t>
+            <w:instrText xml:space="preserve"> PAGEREF _Toc12117 \h </w:instrText>
+          </w:r>
+          <w:r>
+            <w:fldChar w:fldCharType="separate"/>
+          </w:r>
+          <w:r>
+            <w:t>26</w:t>
           </w:r>
           <w:r>
             <w:fldChar w:fldCharType="end"/>
@@ -1864,7 +2474,7 @@
             <w:fldChar w:fldCharType="begin"/>
           </w:r>
           <w:r>
-            <w:instrText xml:space="preserve"> HYPERLINK \l _Toc7411 </w:instrText>
+            <w:instrText xml:space="preserve"> HYPERLINK \l _Toc11898 </w:instrText>
           </w:r>
           <w:r>
             <w:fldChar w:fldCharType="separate"/>
@@ -1886,13 +2496,13 @@
             <w:fldChar w:fldCharType="begin"/>
           </w:r>
           <w:r>
-            <w:instrText xml:space="preserve"> PAGEREF _Toc7411 \h </w:instrText>
-          </w:r>
-          <w:r>
-            <w:fldChar w:fldCharType="separate"/>
-          </w:r>
-          <w:r>
-            <w:t>24</w:t>
+            <w:instrText xml:space="preserve"> PAGEREF _Toc11898 \h </w:instrText>
+          </w:r>
+          <w:r>
+            <w:fldChar w:fldCharType="separate"/>
+          </w:r>
+          <w:r>
+            <w:t>26</w:t>
           </w:r>
           <w:r>
             <w:fldChar w:fldCharType="end"/>
@@ -1912,7 +2522,7 @@
             <w:fldChar w:fldCharType="begin"/>
           </w:r>
           <w:r>
-            <w:instrText xml:space="preserve"> HYPERLINK \l _Toc25554 </w:instrText>
+            <w:instrText xml:space="preserve"> HYPERLINK \l _Toc15813 </w:instrText>
           </w:r>
           <w:r>
             <w:fldChar w:fldCharType="separate"/>
@@ -1934,13 +2544,13 @@
             <w:fldChar w:fldCharType="begin"/>
           </w:r>
           <w:r>
-            <w:instrText xml:space="preserve"> PAGEREF _Toc25554 \h </w:instrText>
-          </w:r>
-          <w:r>
-            <w:fldChar w:fldCharType="separate"/>
-          </w:r>
-          <w:r>
-            <w:t>24</w:t>
+            <w:instrText xml:space="preserve"> PAGEREF _Toc15813 \h </w:instrText>
+          </w:r>
+          <w:r>
+            <w:fldChar w:fldCharType="separate"/>
+          </w:r>
+          <w:r>
+            <w:t>26</w:t>
           </w:r>
           <w:r>
             <w:fldChar w:fldCharType="end"/>
@@ -1960,7 +2570,7 @@
             <w:fldChar w:fldCharType="begin"/>
           </w:r>
           <w:r>
-            <w:instrText xml:space="preserve"> HYPERLINK \l _Toc9382 </w:instrText>
+            <w:instrText xml:space="preserve"> HYPERLINK \l _Toc5541 </w:instrText>
           </w:r>
           <w:r>
             <w:fldChar w:fldCharType="separate"/>
@@ -1982,13 +2592,13 @@
             <w:fldChar w:fldCharType="begin"/>
           </w:r>
           <w:r>
-            <w:instrText xml:space="preserve"> PAGEREF _Toc9382 \h </w:instrText>
-          </w:r>
-          <w:r>
-            <w:fldChar w:fldCharType="separate"/>
-          </w:r>
-          <w:r>
-            <w:t>24</w:t>
+            <w:instrText xml:space="preserve"> PAGEREF _Toc5541 \h </w:instrText>
+          </w:r>
+          <w:r>
+            <w:fldChar w:fldCharType="separate"/>
+          </w:r>
+          <w:r>
+            <w:t>26</w:t>
           </w:r>
           <w:r>
             <w:fldChar w:fldCharType="end"/>
@@ -2008,7 +2618,7 @@
             <w:fldChar w:fldCharType="begin"/>
           </w:r>
           <w:r>
-            <w:instrText xml:space="preserve"> HYPERLINK \l _Toc18375 </w:instrText>
+            <w:instrText xml:space="preserve"> HYPERLINK \l _Toc14576 </w:instrText>
           </w:r>
           <w:r>
             <w:fldChar w:fldCharType="separate"/>
@@ -2030,13 +2640,13 @@
             <w:fldChar w:fldCharType="begin"/>
           </w:r>
           <w:r>
-            <w:instrText xml:space="preserve"> PAGEREF _Toc18375 \h </w:instrText>
-          </w:r>
-          <w:r>
-            <w:fldChar w:fldCharType="separate"/>
-          </w:r>
-          <w:r>
-            <w:t>24</w:t>
+            <w:instrText xml:space="preserve"> PAGEREF _Toc14576 \h </w:instrText>
+          </w:r>
+          <w:r>
+            <w:fldChar w:fldCharType="separate"/>
+          </w:r>
+          <w:r>
+            <w:t>26</w:t>
           </w:r>
           <w:r>
             <w:fldChar w:fldCharType="end"/>
@@ -2056,7 +2666,7 @@
             <w:fldChar w:fldCharType="begin"/>
           </w:r>
           <w:r>
-            <w:instrText xml:space="preserve"> HYPERLINK \l _Toc31675 </w:instrText>
+            <w:instrText xml:space="preserve"> HYPERLINK \l _Toc22970 </w:instrText>
           </w:r>
           <w:r>
             <w:fldChar w:fldCharType="separate"/>
@@ -2078,13 +2688,13 @@
             <w:fldChar w:fldCharType="begin"/>
           </w:r>
           <w:r>
-            <w:instrText xml:space="preserve"> PAGEREF _Toc31675 \h </w:instrText>
-          </w:r>
-          <w:r>
-            <w:fldChar w:fldCharType="separate"/>
-          </w:r>
-          <w:r>
-            <w:t>24</w:t>
+            <w:instrText xml:space="preserve"> PAGEREF _Toc22970 \h </w:instrText>
+          </w:r>
+          <w:r>
+            <w:fldChar w:fldCharType="separate"/>
+          </w:r>
+          <w:r>
+            <w:t>26</w:t>
           </w:r>
           <w:r>
             <w:fldChar w:fldCharType="end"/>
@@ -2104,7 +2714,7 @@
             <w:fldChar w:fldCharType="begin"/>
           </w:r>
           <w:r>
-            <w:instrText xml:space="preserve"> HYPERLINK \l _Toc23882 </w:instrText>
+            <w:instrText xml:space="preserve"> HYPERLINK \l _Toc29963 </w:instrText>
           </w:r>
           <w:r>
             <w:fldChar w:fldCharType="separate"/>
@@ -2126,13 +2736,13 @@
             <w:fldChar w:fldCharType="begin"/>
           </w:r>
           <w:r>
-            <w:instrText xml:space="preserve"> PAGEREF _Toc23882 \h </w:instrText>
-          </w:r>
-          <w:r>
-            <w:fldChar w:fldCharType="separate"/>
-          </w:r>
-          <w:r>
-            <w:t>25</w:t>
+            <w:instrText xml:space="preserve"> PAGEREF _Toc29963 \h </w:instrText>
+          </w:r>
+          <w:r>
+            <w:fldChar w:fldCharType="separate"/>
+          </w:r>
+          <w:r>
+            <w:t>27</w:t>
           </w:r>
           <w:r>
             <w:fldChar w:fldCharType="end"/>
@@ -2152,7 +2762,7 @@
             <w:fldChar w:fldCharType="begin"/>
           </w:r>
           <w:r>
-            <w:instrText xml:space="preserve"> HYPERLINK \l _Toc7 </w:instrText>
+            <w:instrText xml:space="preserve"> HYPERLINK \l _Toc4352 </w:instrText>
           </w:r>
           <w:r>
             <w:fldChar w:fldCharType="separate"/>
@@ -2174,13 +2784,13 @@
             <w:fldChar w:fldCharType="begin"/>
           </w:r>
           <w:r>
-            <w:instrText xml:space="preserve"> PAGEREF _Toc7 \h </w:instrText>
-          </w:r>
-          <w:r>
-            <w:fldChar w:fldCharType="separate"/>
-          </w:r>
-          <w:r>
-            <w:t>25</w:t>
+            <w:instrText xml:space="preserve"> PAGEREF _Toc4352 \h </w:instrText>
+          </w:r>
+          <w:r>
+            <w:fldChar w:fldCharType="separate"/>
+          </w:r>
+          <w:r>
+            <w:t>27</w:t>
           </w:r>
           <w:r>
             <w:fldChar w:fldCharType="end"/>
@@ -2200,7 +2810,7 @@
             <w:fldChar w:fldCharType="begin"/>
           </w:r>
           <w:r>
-            <w:instrText xml:space="preserve"> HYPERLINK \l _Toc17022 </w:instrText>
+            <w:instrText xml:space="preserve"> HYPERLINK \l _Toc32406 </w:instrText>
           </w:r>
           <w:r>
             <w:fldChar w:fldCharType="separate"/>
@@ -2222,13 +2832,13 @@
             <w:fldChar w:fldCharType="begin"/>
           </w:r>
           <w:r>
-            <w:instrText xml:space="preserve"> PAGEREF _Toc17022 \h </w:instrText>
-          </w:r>
-          <w:r>
-            <w:fldChar w:fldCharType="separate"/>
-          </w:r>
-          <w:r>
-            <w:t>25</w:t>
+            <w:instrText xml:space="preserve"> PAGEREF _Toc32406 \h </w:instrText>
+          </w:r>
+          <w:r>
+            <w:fldChar w:fldCharType="separate"/>
+          </w:r>
+          <w:r>
+            <w:t>27</w:t>
           </w:r>
           <w:r>
             <w:fldChar w:fldCharType="end"/>
@@ -2248,7 +2858,7 @@
             <w:fldChar w:fldCharType="begin"/>
           </w:r>
           <w:r>
-            <w:instrText xml:space="preserve"> HYPERLINK \l _Toc14401 </w:instrText>
+            <w:instrText xml:space="preserve"> HYPERLINK \l _Toc4068 </w:instrText>
           </w:r>
           <w:r>
             <w:fldChar w:fldCharType="separate"/>
@@ -2270,13 +2880,13 @@
             <w:fldChar w:fldCharType="begin"/>
           </w:r>
           <w:r>
-            <w:instrText xml:space="preserve"> PAGEREF _Toc14401 \h </w:instrText>
-          </w:r>
-          <w:r>
-            <w:fldChar w:fldCharType="separate"/>
-          </w:r>
-          <w:r>
-            <w:t>25</w:t>
+            <w:instrText xml:space="preserve"> PAGEREF _Toc4068 \h </w:instrText>
+          </w:r>
+          <w:r>
+            <w:fldChar w:fldCharType="separate"/>
+          </w:r>
+          <w:r>
+            <w:t>27</w:t>
           </w:r>
           <w:r>
             <w:fldChar w:fldCharType="end"/>
@@ -2296,7 +2906,7 @@
             <w:fldChar w:fldCharType="begin"/>
           </w:r>
           <w:r>
-            <w:instrText xml:space="preserve"> HYPERLINK \l _Toc10228 </w:instrText>
+            <w:instrText xml:space="preserve"> HYPERLINK \l _Toc12919 </w:instrText>
           </w:r>
           <w:r>
             <w:fldChar w:fldCharType="separate"/>
@@ -2328,13 +2938,13 @@
             <w:fldChar w:fldCharType="begin"/>
           </w:r>
           <w:r>
-            <w:instrText xml:space="preserve"> PAGEREF _Toc10228 \h </w:instrText>
-          </w:r>
-          <w:r>
-            <w:fldChar w:fldCharType="separate"/>
-          </w:r>
-          <w:r>
-            <w:t>25</w:t>
+            <w:instrText xml:space="preserve"> PAGEREF _Toc12919 \h </w:instrText>
+          </w:r>
+          <w:r>
+            <w:fldChar w:fldCharType="separate"/>
+          </w:r>
+          <w:r>
+            <w:t>27</w:t>
           </w:r>
           <w:r>
             <w:fldChar w:fldCharType="end"/>
@@ -2354,7 +2964,7 @@
             <w:fldChar w:fldCharType="begin"/>
           </w:r>
           <w:r>
-            <w:instrText xml:space="preserve"> HYPERLINK \l _Toc3228 </w:instrText>
+            <w:instrText xml:space="preserve"> HYPERLINK \l _Toc22843 </w:instrText>
           </w:r>
           <w:r>
             <w:fldChar w:fldCharType="separate"/>
@@ -2379,13 +2989,13 @@
             <w:fldChar w:fldCharType="begin"/>
           </w:r>
           <w:r>
-            <w:instrText xml:space="preserve"> PAGEREF _Toc3228 \h </w:instrText>
-          </w:r>
-          <w:r>
-            <w:fldChar w:fldCharType="separate"/>
-          </w:r>
-          <w:r>
-            <w:t>25</w:t>
+            <w:instrText xml:space="preserve"> PAGEREF _Toc22843 \h </w:instrText>
+          </w:r>
+          <w:r>
+            <w:fldChar w:fldCharType="separate"/>
+          </w:r>
+          <w:r>
+            <w:t>27</w:t>
           </w:r>
           <w:r>
             <w:fldChar w:fldCharType="end"/>
@@ -2405,7 +3015,7 @@
             <w:fldChar w:fldCharType="begin"/>
           </w:r>
           <w:r>
-            <w:instrText xml:space="preserve"> HYPERLINK \l _Toc3916 </w:instrText>
+            <w:instrText xml:space="preserve"> HYPERLINK \l _Toc17321 </w:instrText>
           </w:r>
           <w:r>
             <w:fldChar w:fldCharType="separate"/>
@@ -2427,13 +3037,13 @@
             <w:fldChar w:fldCharType="begin"/>
           </w:r>
           <w:r>
-            <w:instrText xml:space="preserve"> PAGEREF _Toc3916 \h </w:instrText>
-          </w:r>
-          <w:r>
-            <w:fldChar w:fldCharType="separate"/>
-          </w:r>
-          <w:r>
-            <w:t>26</w:t>
+            <w:instrText xml:space="preserve"> PAGEREF _Toc17321 \h </w:instrText>
+          </w:r>
+          <w:r>
+            <w:fldChar w:fldCharType="separate"/>
+          </w:r>
+          <w:r>
+            <w:t>28</w:t>
           </w:r>
           <w:r>
             <w:fldChar w:fldCharType="end"/>
@@ -2453,7 +3063,7 @@
             <w:fldChar w:fldCharType="begin"/>
           </w:r>
           <w:r>
-            <w:instrText xml:space="preserve"> HYPERLINK \l _Toc20850 </w:instrText>
+            <w:instrText xml:space="preserve"> HYPERLINK \l _Toc2465 </w:instrText>
           </w:r>
           <w:r>
             <w:fldChar w:fldCharType="separate"/>
@@ -2468,13 +3078,13 @@
             <w:fldChar w:fldCharType="begin"/>
           </w:r>
           <w:r>
-            <w:instrText xml:space="preserve"> PAGEREF _Toc20850 \h </w:instrText>
-          </w:r>
-          <w:r>
-            <w:fldChar w:fldCharType="separate"/>
-          </w:r>
-          <w:r>
-            <w:t>26</w:t>
+            <w:instrText xml:space="preserve"> PAGEREF _Toc2465 \h </w:instrText>
+          </w:r>
+          <w:r>
+            <w:fldChar w:fldCharType="separate"/>
+          </w:r>
+          <w:r>
+            <w:t>28</w:t>
           </w:r>
           <w:r>
             <w:fldChar w:fldCharType="end"/>
@@ -2494,7 +3104,7 @@
             <w:fldChar w:fldCharType="begin"/>
           </w:r>
           <w:r>
-            <w:instrText xml:space="preserve"> HYPERLINK \l _Toc22484 </w:instrText>
+            <w:instrText xml:space="preserve"> HYPERLINK \l _Toc927 </w:instrText>
           </w:r>
           <w:r>
             <w:fldChar w:fldCharType="separate"/>
@@ -2509,13 +3119,13 @@
             <w:fldChar w:fldCharType="begin"/>
           </w:r>
           <w:r>
-            <w:instrText xml:space="preserve"> PAGEREF _Toc22484 \h </w:instrText>
-          </w:r>
-          <w:r>
-            <w:fldChar w:fldCharType="separate"/>
-          </w:r>
-          <w:r>
-            <w:t>26</w:t>
+            <w:instrText xml:space="preserve"> PAGEREF _Toc927 \h </w:instrText>
+          </w:r>
+          <w:r>
+            <w:fldChar w:fldCharType="separate"/>
+          </w:r>
+          <w:r>
+            <w:t>28</w:t>
           </w:r>
           <w:r>
             <w:fldChar w:fldCharType="end"/>
@@ -2535,7 +3145,7 @@
             <w:fldChar w:fldCharType="begin"/>
           </w:r>
           <w:r>
-            <w:instrText xml:space="preserve"> HYPERLINK \l _Toc7139 </w:instrText>
+            <w:instrText xml:space="preserve"> HYPERLINK \l _Toc24292 </w:instrText>
           </w:r>
           <w:r>
             <w:fldChar w:fldCharType="separate"/>
@@ -2550,13 +3160,13 @@
             <w:fldChar w:fldCharType="begin"/>
           </w:r>
           <w:r>
-            <w:instrText xml:space="preserve"> PAGEREF _Toc7139 \h </w:instrText>
-          </w:r>
-          <w:r>
-            <w:fldChar w:fldCharType="separate"/>
-          </w:r>
-          <w:r>
-            <w:t>26</w:t>
+            <w:instrText xml:space="preserve"> PAGEREF _Toc24292 \h </w:instrText>
+          </w:r>
+          <w:r>
+            <w:fldChar w:fldCharType="separate"/>
+          </w:r>
+          <w:r>
+            <w:t>28</w:t>
           </w:r>
           <w:r>
             <w:fldChar w:fldCharType="end"/>
@@ -2576,7 +3186,7 @@
             <w:fldChar w:fldCharType="begin"/>
           </w:r>
           <w:r>
-            <w:instrText xml:space="preserve"> HYPERLINK \l _Toc20742 </w:instrText>
+            <w:instrText xml:space="preserve"> HYPERLINK \l _Toc10895 </w:instrText>
           </w:r>
           <w:r>
             <w:fldChar w:fldCharType="separate"/>
@@ -2591,13 +3201,13 @@
             <w:fldChar w:fldCharType="begin"/>
           </w:r>
           <w:r>
-            <w:instrText xml:space="preserve"> PAGEREF _Toc20742 \h </w:instrText>
-          </w:r>
-          <w:r>
-            <w:fldChar w:fldCharType="separate"/>
-          </w:r>
-          <w:r>
-            <w:t>26</w:t>
+            <w:instrText xml:space="preserve"> PAGEREF _Toc10895 \h </w:instrText>
+          </w:r>
+          <w:r>
+            <w:fldChar w:fldCharType="separate"/>
+          </w:r>
+          <w:r>
+            <w:t>28</w:t>
           </w:r>
           <w:r>
             <w:fldChar w:fldCharType="end"/>
@@ -2617,7 +3227,7 @@
             <w:fldChar w:fldCharType="begin"/>
           </w:r>
           <w:r>
-            <w:instrText xml:space="preserve"> HYPERLINK \l _Toc22744 </w:instrText>
+            <w:instrText xml:space="preserve"> HYPERLINK \l _Toc17294 </w:instrText>
           </w:r>
           <w:r>
             <w:fldChar w:fldCharType="separate"/>
@@ -2632,13 +3242,13 @@
             <w:fldChar w:fldCharType="begin"/>
           </w:r>
           <w:r>
-            <w:instrText xml:space="preserve"> PAGEREF _Toc22744 \h </w:instrText>
-          </w:r>
-          <w:r>
-            <w:fldChar w:fldCharType="separate"/>
-          </w:r>
-          <w:r>
-            <w:t>27</w:t>
+            <w:instrText xml:space="preserve"> PAGEREF _Toc17294 \h </w:instrText>
+          </w:r>
+          <w:r>
+            <w:fldChar w:fldCharType="separate"/>
+          </w:r>
+          <w:r>
+            <w:t>29</w:t>
           </w:r>
           <w:r>
             <w:fldChar w:fldCharType="end"/>
@@ -2658,7 +3268,7 @@
             <w:fldChar w:fldCharType="begin"/>
           </w:r>
           <w:r>
-            <w:instrText xml:space="preserve"> HYPERLINK \l _Toc2587 </w:instrText>
+            <w:instrText xml:space="preserve"> HYPERLINK \l _Toc1854 </w:instrText>
           </w:r>
           <w:r>
             <w:fldChar w:fldCharType="separate"/>
@@ -2673,13 +3283,13 @@
             <w:fldChar w:fldCharType="begin"/>
           </w:r>
           <w:r>
-            <w:instrText xml:space="preserve"> PAGEREF _Toc2587 \h </w:instrText>
-          </w:r>
-          <w:r>
-            <w:fldChar w:fldCharType="separate"/>
-          </w:r>
-          <w:r>
-            <w:t>27</w:t>
+            <w:instrText xml:space="preserve"> PAGEREF _Toc1854 \h </w:instrText>
+          </w:r>
+          <w:r>
+            <w:fldChar w:fldCharType="separate"/>
+          </w:r>
+          <w:r>
+            <w:t>29</w:t>
           </w:r>
           <w:r>
             <w:fldChar w:fldCharType="end"/>
@@ -2699,7 +3309,7 @@
             <w:fldChar w:fldCharType="begin"/>
           </w:r>
           <w:r>
-            <w:instrText xml:space="preserve"> HYPERLINK \l _Toc8406 </w:instrText>
+            <w:instrText xml:space="preserve"> HYPERLINK \l _Toc18453 </w:instrText>
           </w:r>
           <w:r>
             <w:fldChar w:fldCharType="separate"/>
@@ -2714,13 +3324,13 @@
             <w:fldChar w:fldCharType="begin"/>
           </w:r>
           <w:r>
-            <w:instrText xml:space="preserve"> PAGEREF _Toc8406 \h </w:instrText>
-          </w:r>
-          <w:r>
-            <w:fldChar w:fldCharType="separate"/>
-          </w:r>
-          <w:r>
-            <w:t>27</w:t>
+            <w:instrText xml:space="preserve"> PAGEREF _Toc18453 \h </w:instrText>
+          </w:r>
+          <w:r>
+            <w:fldChar w:fldCharType="separate"/>
+          </w:r>
+          <w:r>
+            <w:t>29</w:t>
           </w:r>
           <w:r>
             <w:fldChar w:fldCharType="end"/>
@@ -2740,7 +3350,7 @@
             <w:fldChar w:fldCharType="begin"/>
           </w:r>
           <w:r>
-            <w:instrText xml:space="preserve"> HYPERLINK \l _Toc3851 </w:instrText>
+            <w:instrText xml:space="preserve"> HYPERLINK \l _Toc31239 </w:instrText>
           </w:r>
           <w:r>
             <w:fldChar w:fldCharType="separate"/>
@@ -2755,13 +3365,13 @@
             <w:fldChar w:fldCharType="begin"/>
           </w:r>
           <w:r>
-            <w:instrText xml:space="preserve"> PAGEREF _Toc3851 \h </w:instrText>
-          </w:r>
-          <w:r>
-            <w:fldChar w:fldCharType="separate"/>
-          </w:r>
-          <w:r>
-            <w:t>27</w:t>
+            <w:instrText xml:space="preserve"> PAGEREF _Toc31239 \h </w:instrText>
+          </w:r>
+          <w:r>
+            <w:fldChar w:fldCharType="separate"/>
+          </w:r>
+          <w:r>
+            <w:t>29</w:t>
           </w:r>
           <w:r>
             <w:fldChar w:fldCharType="end"/>
@@ -2781,7 +3391,7 @@
             <w:fldChar w:fldCharType="begin"/>
           </w:r>
           <w:r>
-            <w:instrText xml:space="preserve"> HYPERLINK \l _Toc22383 </w:instrText>
+            <w:instrText xml:space="preserve"> HYPERLINK \l _Toc32316 </w:instrText>
           </w:r>
           <w:r>
             <w:fldChar w:fldCharType="separate"/>
@@ -2796,13 +3406,13 @@
             <w:fldChar w:fldCharType="begin"/>
           </w:r>
           <w:r>
-            <w:instrText xml:space="preserve"> PAGEREF _Toc22383 \h </w:instrText>
-          </w:r>
-          <w:r>
-            <w:fldChar w:fldCharType="separate"/>
-          </w:r>
-          <w:r>
-            <w:t>27</w:t>
+            <w:instrText xml:space="preserve"> PAGEREF _Toc32316 \h </w:instrText>
+          </w:r>
+          <w:r>
+            <w:fldChar w:fldCharType="separate"/>
+          </w:r>
+          <w:r>
+            <w:t>29</w:t>
           </w:r>
           <w:r>
             <w:fldChar w:fldCharType="end"/>
@@ -2822,7 +3432,7 @@
             <w:fldChar w:fldCharType="begin"/>
           </w:r>
           <w:r>
-            <w:instrText xml:space="preserve"> HYPERLINK \l _Toc1708 </w:instrText>
+            <w:instrText xml:space="preserve"> HYPERLINK \l _Toc32045 </w:instrText>
           </w:r>
           <w:r>
             <w:fldChar w:fldCharType="separate"/>
@@ -2837,13 +3447,13 @@
             <w:fldChar w:fldCharType="begin"/>
           </w:r>
           <w:r>
-            <w:instrText xml:space="preserve"> PAGEREF _Toc1708 \h </w:instrText>
-          </w:r>
-          <w:r>
-            <w:fldChar w:fldCharType="separate"/>
-          </w:r>
-          <w:r>
-            <w:t>27</w:t>
+            <w:instrText xml:space="preserve"> PAGEREF _Toc32045 \h </w:instrText>
+          </w:r>
+          <w:r>
+            <w:fldChar w:fldCharType="separate"/>
+          </w:r>
+          <w:r>
+            <w:t>29</w:t>
           </w:r>
           <w:r>
             <w:fldChar w:fldCharType="end"/>
@@ -2884,7 +3494,7 @@
       <w:pPr>
         <w:pStyle w:val="2"/>
       </w:pPr>
-      <w:bookmarkStart w:id="1" w:name="_Toc4592"/>
+      <w:bookmarkStart w:id="1" w:name="_Toc14500"/>
       <w:r>
         <w:t>1. 产品简介</w:t>
       </w:r>
@@ -2902,7 +3512,7 @@
       <w:pPr>
         <w:pStyle w:val="3"/>
       </w:pPr>
-      <w:bookmarkStart w:id="2" w:name="_Toc7652"/>
+      <w:bookmarkStart w:id="2" w:name="_Toc26843"/>
       <w:r>
         <w:t>1.1 主要特性</w:t>
       </w:r>
@@ -2910,7 +3520,7 @@
     </w:p>
     <w:p>
       <w:pPr>
-        <w:pStyle w:val="18"/>
+        <w:pStyle w:val="19"/>
         <w:numPr>
           <w:ilvl w:val="0"/>
           <w:numId w:val="1"/>
@@ -2922,7 +3532,7 @@
     </w:p>
     <w:p>
       <w:pPr>
-        <w:pStyle w:val="18"/>
+        <w:pStyle w:val="19"/>
         <w:numPr>
           <w:ilvl w:val="0"/>
           <w:numId w:val="1"/>
@@ -2934,7 +3544,7 @@
     </w:p>
     <w:p>
       <w:pPr>
-        <w:pStyle w:val="18"/>
+        <w:pStyle w:val="19"/>
         <w:numPr>
           <w:ilvl w:val="0"/>
           <w:numId w:val="1"/>
@@ -2946,7 +3556,7 @@
     </w:p>
     <w:p>
       <w:pPr>
-        <w:pStyle w:val="18"/>
+        <w:pStyle w:val="19"/>
         <w:numPr>
           <w:ilvl w:val="0"/>
           <w:numId w:val="1"/>
@@ -2958,7 +3568,7 @@
     </w:p>
     <w:p>
       <w:pPr>
-        <w:pStyle w:val="18"/>
+        <w:pStyle w:val="19"/>
         <w:numPr>
           <w:ilvl w:val="0"/>
           <w:numId w:val="1"/>
@@ -2970,7 +3580,7 @@
     </w:p>
     <w:p>
       <w:pPr>
-        <w:pStyle w:val="18"/>
+        <w:pStyle w:val="19"/>
         <w:numPr>
           <w:ilvl w:val="0"/>
           <w:numId w:val="1"/>
@@ -2986,7 +3596,7 @@
     </w:p>
     <w:p>
       <w:pPr>
-        <w:pStyle w:val="18"/>
+        <w:pStyle w:val="19"/>
         <w:numPr>
           <w:ilvl w:val="0"/>
           <w:numId w:val="1"/>
@@ -3009,7 +3619,7 @@
       <w:pPr>
         <w:pStyle w:val="2"/>
       </w:pPr>
-      <w:bookmarkStart w:id="3" w:name="_Toc11282"/>
+      <w:bookmarkStart w:id="3" w:name="_Toc7356"/>
       <w:r>
         <w:t>2. 功能说明</w:t>
       </w:r>
@@ -3019,7 +3629,7 @@
       <w:pPr>
         <w:pStyle w:val="3"/>
       </w:pPr>
-      <w:bookmarkStart w:id="4" w:name="_Toc3669"/>
+      <w:bookmarkStart w:id="4" w:name="_Toc23352"/>
       <w:r>
         <w:t>2.1 账套管理（Tab1）</w:t>
       </w:r>
@@ -3083,7 +3693,7 @@
     </w:p>
     <w:p>
       <w:pPr>
-        <w:pStyle w:val="18"/>
+        <w:pStyle w:val="19"/>
         <w:numPr>
           <w:ilvl w:val="0"/>
           <w:numId w:val="1"/>
@@ -3102,7 +3712,7 @@
     </w:p>
     <w:p>
       <w:pPr>
-        <w:pStyle w:val="18"/>
+        <w:pStyle w:val="19"/>
         <w:numPr>
           <w:ilvl w:val="0"/>
           <w:numId w:val="1"/>
@@ -3127,7 +3737,7 @@
     </w:p>
     <w:p>
       <w:pPr>
-        <w:pStyle w:val="18"/>
+        <w:pStyle w:val="19"/>
         <w:numPr>
           <w:ilvl w:val="0"/>
           <w:numId w:val="1"/>
@@ -3179,7 +3789,7 @@
     </w:p>
     <w:p>
       <w:pPr>
-        <w:pStyle w:val="18"/>
+        <w:pStyle w:val="19"/>
         <w:numPr>
           <w:ilvl w:val="0"/>
           <w:numId w:val="1"/>
@@ -3198,7 +3808,7 @@
     </w:p>
     <w:p>
       <w:pPr>
-        <w:pStyle w:val="18"/>
+        <w:pStyle w:val="19"/>
         <w:numPr>
           <w:ilvl w:val="0"/>
           <w:numId w:val="1"/>
@@ -3217,7 +3827,7 @@
     </w:p>
     <w:p>
       <w:pPr>
-        <w:pStyle w:val="18"/>
+        <w:pStyle w:val="19"/>
         <w:numPr>
           <w:ilvl w:val="0"/>
           <w:numId w:val="1"/>
@@ -3250,7 +3860,7 @@
     </w:p>
     <w:p>
       <w:pPr>
-        <w:pStyle w:val="18"/>
+        <w:pStyle w:val="19"/>
         <w:numPr>
           <w:ilvl w:val="0"/>
           <w:numId w:val="1"/>
@@ -3281,7 +3891,7 @@
     </w:p>
     <w:p>
       <w:pPr>
-        <w:pStyle w:val="18"/>
+        <w:pStyle w:val="19"/>
         <w:numPr>
           <w:ilvl w:val="0"/>
           <w:numId w:val="1"/>
@@ -3310,7 +3920,7 @@
     </w:p>
     <w:p>
       <w:pPr>
-        <w:pStyle w:val="18"/>
+        <w:pStyle w:val="19"/>
         <w:numPr>
           <w:ilvl w:val="0"/>
           <w:numId w:val="1"/>
@@ -3341,8 +3951,9 @@
     </w:p>
     <w:p>
       <w:pPr>
-        <w:pStyle w:val="18"/>
+        <w:pStyle w:val="19"/>
         <w:numPr>
+          <w:ilvl w:val="0"/>
           <w:numId w:val="0"/>
         </w:numPr>
         <w:ind w:left="360" w:leftChars="0"/>
@@ -3356,8 +3967,9 @@
     </w:p>
     <w:p>
       <w:pPr>
-        <w:pStyle w:val="18"/>
+        <w:pStyle w:val="19"/>
         <w:numPr>
+          <w:ilvl w:val="0"/>
           <w:numId w:val="0"/>
         </w:numPr>
         <w:rPr>
@@ -3383,7 +3995,7 @@
     </w:p>
     <w:p>
       <w:pPr>
-        <w:pStyle w:val="18"/>
+        <w:pStyle w:val="19"/>
         <w:numPr>
           <w:ilvl w:val="0"/>
           <w:numId w:val="2"/>
@@ -3403,8 +4015,9 @@
     </w:p>
     <w:p>
       <w:pPr>
-        <w:pStyle w:val="18"/>
+        <w:pStyle w:val="19"/>
         <w:numPr>
+          <w:ilvl w:val="0"/>
           <w:numId w:val="0"/>
         </w:numPr>
         <w:rPr>
@@ -3458,7 +4071,7 @@
     </w:p>
     <w:p>
       <w:pPr>
-        <w:pStyle w:val="18"/>
+        <w:pStyle w:val="19"/>
         <w:numPr>
           <w:ilvl w:val="0"/>
           <w:numId w:val="2"/>
@@ -3478,8 +4091,9 @@
     </w:p>
     <w:p>
       <w:pPr>
-        <w:pStyle w:val="18"/>
+        <w:pStyle w:val="19"/>
         <w:numPr>
+          <w:ilvl w:val="0"/>
           <w:numId w:val="0"/>
         </w:numPr>
         <w:rPr>
@@ -3509,8 +4123,9 @@
     </w:p>
     <w:p>
       <w:pPr>
-        <w:pStyle w:val="18"/>
+        <w:pStyle w:val="19"/>
         <w:numPr>
+          <w:ilvl w:val="0"/>
           <w:numId w:val="0"/>
         </w:numPr>
         <w:rPr>
@@ -3540,8 +4155,9 @@
     </w:p>
     <w:p>
       <w:pPr>
-        <w:pStyle w:val="18"/>
+        <w:pStyle w:val="19"/>
         <w:numPr>
+          <w:ilvl w:val="0"/>
           <w:numId w:val="0"/>
         </w:numPr>
         <w:rPr>
@@ -3571,8 +4187,9 @@
     </w:p>
     <w:p>
       <w:pPr>
-        <w:pStyle w:val="18"/>
+        <w:pStyle w:val="19"/>
         <w:numPr>
+          <w:ilvl w:val="0"/>
           <w:numId w:val="0"/>
         </w:numPr>
       </w:pPr>
@@ -3622,64 +4239,72 @@
     </w:p>
     <w:p>
       <w:pPr>
-        <w:pStyle w:val="18"/>
+        <w:pStyle w:val="19"/>
         <w:numPr>
+          <w:ilvl w:val="0"/>
           <w:numId w:val="0"/>
         </w:numPr>
       </w:pPr>
     </w:p>
     <w:p>
       <w:pPr>
-        <w:pStyle w:val="18"/>
+        <w:pStyle w:val="19"/>
         <w:numPr>
+          <w:ilvl w:val="0"/>
           <w:numId w:val="0"/>
         </w:numPr>
       </w:pPr>
     </w:p>
     <w:p>
       <w:pPr>
-        <w:pStyle w:val="18"/>
+        <w:pStyle w:val="19"/>
         <w:numPr>
+          <w:ilvl w:val="0"/>
           <w:numId w:val="0"/>
         </w:numPr>
       </w:pPr>
     </w:p>
     <w:p>
       <w:pPr>
-        <w:pStyle w:val="18"/>
+        <w:pStyle w:val="19"/>
         <w:numPr>
+          <w:ilvl w:val="0"/>
           <w:numId w:val="0"/>
         </w:numPr>
       </w:pPr>
     </w:p>
     <w:p>
       <w:pPr>
-        <w:pStyle w:val="18"/>
+        <w:pStyle w:val="19"/>
         <w:numPr>
+          <w:ilvl w:val="0"/>
           <w:numId w:val="0"/>
         </w:numPr>
       </w:pPr>
     </w:p>
     <w:p>
       <w:pPr>
-        <w:pStyle w:val="18"/>
+        <w:pStyle w:val="19"/>
         <w:numPr>
+          <w:ilvl w:val="0"/>
           <w:numId w:val="0"/>
         </w:numPr>
       </w:pPr>
     </w:p>
     <w:p>
       <w:pPr>
-        <w:pStyle w:val="18"/>
+        <w:pStyle w:val="19"/>
         <w:numPr>
+          <w:ilvl w:val="0"/>
           <w:numId w:val="0"/>
         </w:numPr>
       </w:pPr>
     </w:p>
     <w:p>
       <w:pPr>
-        <w:pStyle w:val="18"/>
+        <w:pStyle w:val="19"/>
         <w:numPr>
+          <w:ilvl w:val="0"/>
           <w:numId w:val="0"/>
         </w:numPr>
         <w:rPr>
@@ -3692,7 +4317,7 @@
       <w:pPr>
         <w:pStyle w:val="3"/>
       </w:pPr>
-      <w:bookmarkStart w:id="5" w:name="_Toc6233"/>
+      <w:bookmarkStart w:id="5" w:name="_Toc23132"/>
       <w:r>
         <w:t>2.2 工具箱（Tab2）</w:t>
       </w:r>
@@ -3741,12 +4366,6 @@
             <w:insideH w:val="single" w:color="auto" w:sz="4" w:space="0"/>
             <w:insideV w:val="single" w:color="auto" w:sz="4" w:space="0"/>
           </w:tblBorders>
-          <w:tblCellMar>
-            <w:top w:w="0" w:type="dxa"/>
-            <w:left w:w="10" w:type="dxa"/>
-            <w:bottom w:w="0" w:type="dxa"/>
-            <w:right w:w="10" w:type="dxa"/>
-          </w:tblCellMar>
         </w:tblPrEx>
         <w:trPr>
           <w:tblHeader/>
@@ -3866,7 +4485,7 @@
             </w:r>
             <w:r>
               <w:rPr>
-                <w:rStyle w:val="16"/>
+                <w:rStyle w:val="17"/>
                 <w:sz w:val="22"/>
                 <w:szCs w:val="22"/>
               </w:rPr>
@@ -3874,7 +4493,7 @@
             </w:r>
             <w:r>
               <w:rPr>
-                <w:rStyle w:val="16"/>
+                <w:rStyle w:val="17"/>
                 <w:rFonts w:hint="eastAsia"/>
                 <w:sz w:val="22"/>
                 <w:szCs w:val="22"/>
@@ -3994,7 +4613,7 @@
             </w:r>
             <w:r>
               <w:rPr>
-                <w:rStyle w:val="16"/>
+                <w:rStyle w:val="17"/>
                 <w:rFonts w:hint="eastAsia"/>
                 <w:sz w:val="22"/>
                 <w:szCs w:val="22"/>
@@ -4095,7 +4714,7 @@
             </w:r>
             <w:r>
               <w:rPr>
-                <w:rStyle w:val="16"/>
+                <w:rStyle w:val="17"/>
                 <w:sz w:val="22"/>
                 <w:szCs w:val="22"/>
               </w:rPr>
@@ -4196,7 +4815,7 @@
             </w:r>
             <w:r>
               <w:rPr>
-                <w:rStyle w:val="16"/>
+                <w:rStyle w:val="17"/>
                 <w:sz w:val="22"/>
                 <w:szCs w:val="22"/>
               </w:rPr>
@@ -4270,7 +4889,7 @@
             </w:r>
             <w:r>
               <w:rPr>
-                <w:rStyle w:val="16"/>
+                <w:rStyle w:val="17"/>
               </w:rPr>
               <w:t>跨库复制单据流转</w:t>
             </w:r>
@@ -4325,7 +4944,7 @@
             </w:r>
             <w:r>
               <w:rPr>
-                <w:rStyle w:val="16"/>
+                <w:rStyle w:val="17"/>
               </w:rPr>
               <w:t>跨库复制报表</w:t>
             </w:r>
@@ -4398,7 +5017,7 @@
             </w:r>
             <w:r>
               <w:rPr>
-                <w:rStyle w:val="16"/>
+                <w:rStyle w:val="17"/>
                 <w:rFonts w:hint="eastAsia"/>
                 <w:lang w:val="en-US" w:eastAsia="zh-CN"/>
               </w:rPr>
@@ -4487,7 +5106,7 @@
             </w:r>
             <w:r>
               <w:rPr>
-                <w:rStyle w:val="16"/>
+                <w:rStyle w:val="17"/>
                 <w:rFonts w:hint="eastAsia"/>
                 <w:lang w:val="en-US" w:eastAsia="zh-CN"/>
               </w:rPr>
@@ -4576,7 +5195,7 @@
             </w:r>
             <w:r>
               <w:rPr>
-                <w:rStyle w:val="16"/>
+                <w:rStyle w:val="17"/>
                 <w:rFonts w:hint="eastAsia"/>
                 <w:lang w:val="en-US" w:eastAsia="zh-CN"/>
               </w:rPr>
@@ -4671,7 +5290,7 @@
             </w:r>
             <w:r>
               <w:rPr>
-                <w:rStyle w:val="16"/>
+                <w:rStyle w:val="17"/>
                 <w:rFonts w:hint="eastAsia"/>
                 <w:lang w:val="en-US" w:eastAsia="zh-CN"/>
               </w:rPr>
@@ -4714,6 +5333,95 @@
           </w:p>
         </w:tc>
       </w:tr>
+      <w:tr>
+        <w:tblPrEx>
+          <w:tblBorders>
+            <w:top w:val="single" w:color="auto" w:sz="4" w:space="0"/>
+            <w:left w:val="single" w:color="auto" w:sz="4" w:space="0"/>
+            <w:bottom w:val="single" w:color="auto" w:sz="4" w:space="0"/>
+            <w:right w:val="single" w:color="auto" w:sz="4" w:space="0"/>
+            <w:insideH w:val="single" w:color="auto" w:sz="4" w:space="0"/>
+            <w:insideV w:val="single" w:color="auto" w:sz="4" w:space="0"/>
+          </w:tblBorders>
+          <w:tblCellMar>
+            <w:top w:w="0" w:type="dxa"/>
+            <w:left w:w="10" w:type="dxa"/>
+            <w:bottom w:w="0" w:type="dxa"/>
+            <w:right w:w="10" w:type="dxa"/>
+          </w:tblCellMar>
+        </w:tblPrEx>
+        <w:tc>
+          <w:tcPr>
+            <w:tcW w:w="2400" w:type="dxa"/>
+            <w:shd w:val="clear" w:color="auto" w:fill="F5F5F5"/>
+          </w:tcPr>
+          <w:p>
+            <w:pPr>
+              <w:rPr>
+                <w:rFonts w:hint="default"/>
+                <w:lang w:val="en-US" w:eastAsia="zh-CN"/>
+              </w:rPr>
+            </w:pPr>
+            <w:r>
+              <w:rPr>
+                <w:rFonts w:hint="eastAsia"/>
+                <w:lang w:val="en-US" w:eastAsia="zh-CN"/>
+              </w:rPr>
+              <w:fldChar w:fldCharType="begin"/>
+            </w:r>
+            <w:r>
+              <w:rPr>
+                <w:rFonts w:hint="eastAsia"/>
+                <w:lang w:val="en-US" w:eastAsia="zh-CN"/>
+              </w:rPr>
+              <w:instrText xml:space="preserve"> HYPERLINK \l "_4.12自定义工具" </w:instrText>
+            </w:r>
+            <w:r>
+              <w:rPr>
+                <w:rFonts w:hint="eastAsia"/>
+                <w:lang w:val="en-US" w:eastAsia="zh-CN"/>
+              </w:rPr>
+              <w:fldChar w:fldCharType="separate"/>
+            </w:r>
+            <w:r>
+              <w:rPr>
+                <w:rStyle w:val="17"/>
+                <w:rFonts w:hint="eastAsia"/>
+                <w:lang w:val="en-US" w:eastAsia="zh-CN"/>
+              </w:rPr>
+              <w:t>自定义工具</w:t>
+            </w:r>
+            <w:r>
+              <w:rPr>
+                <w:rFonts w:hint="eastAsia"/>
+                <w:lang w:val="en-US" w:eastAsia="zh-CN"/>
+              </w:rPr>
+              <w:fldChar w:fldCharType="end"/>
+            </w:r>
+          </w:p>
+        </w:tc>
+        <w:tc>
+          <w:tcPr>
+            <w:tcW w:w="6960" w:type="dxa"/>
+            <w:shd w:val="clear" w:color="auto" w:fill="F5F5F5"/>
+          </w:tcPr>
+          <w:p>
+            <w:pPr>
+              <w:rPr>
+                <w:rFonts w:hint="default" w:eastAsia="微软雅黑"/>
+                <w:lang w:val="en-US" w:eastAsia="zh-CN"/>
+              </w:rPr>
+            </w:pPr>
+            <w:r>
+              <w:rPr>
+                <w:rFonts w:hint="eastAsia"/>
+                <w:lang w:val="en-US" w:eastAsia="zh-CN"/>
+              </w:rPr>
+              <w:t>可以自己配置对应工具批量复制对应数据</w:t>
+            </w:r>
+          </w:p>
+        </w:tc>
+      </w:tr>
     </w:tbl>
     <w:p>
       <w:pPr>
@@ -4724,7 +5432,7 @@
       <w:pPr>
         <w:pStyle w:val="2"/>
       </w:pPr>
-      <w:bookmarkStart w:id="6" w:name="_Toc8793"/>
+      <w:bookmarkStart w:id="6" w:name="_Toc4697"/>
       <w:r>
         <w:t>3. 账套管理</w:t>
       </w:r>
@@ -4734,7 +5442,7 @@
       <w:pPr>
         <w:pStyle w:val="3"/>
       </w:pPr>
-      <w:bookmarkStart w:id="7" w:name="_Toc7394"/>
+      <w:bookmarkStart w:id="7" w:name="_Toc23190"/>
       <w:r>
         <w:t>3.1 添加账套</w:t>
       </w:r>
@@ -4750,7 +5458,7 @@
     </w:p>
     <w:p>
       <w:pPr>
-        <w:pStyle w:val="18"/>
+        <w:pStyle w:val="19"/>
         <w:numPr>
           <w:ilvl w:val="0"/>
           <w:numId w:val="3"/>
@@ -4769,7 +5477,7 @@
     </w:p>
     <w:p>
       <w:pPr>
-        <w:pStyle w:val="18"/>
+        <w:pStyle w:val="19"/>
         <w:numPr>
           <w:ilvl w:val="0"/>
           <w:numId w:val="3"/>
@@ -4788,7 +5496,7 @@
     </w:p>
     <w:p>
       <w:pPr>
-        <w:pStyle w:val="18"/>
+        <w:pStyle w:val="19"/>
         <w:numPr>
           <w:ilvl w:val="0"/>
           <w:numId w:val="3"/>
@@ -4807,7 +5515,7 @@
     </w:p>
     <w:p>
       <w:pPr>
-        <w:pStyle w:val="18"/>
+        <w:pStyle w:val="19"/>
         <w:numPr>
           <w:ilvl w:val="0"/>
           <w:numId w:val="3"/>
@@ -4826,7 +5534,7 @@
     </w:p>
     <w:p>
       <w:pPr>
-        <w:pStyle w:val="18"/>
+        <w:pStyle w:val="19"/>
         <w:numPr>
           <w:ilvl w:val="0"/>
           <w:numId w:val="3"/>
@@ -4845,7 +5553,7 @@
     </w:p>
     <w:p>
       <w:pPr>
-        <w:pStyle w:val="18"/>
+        <w:pStyle w:val="19"/>
         <w:numPr>
           <w:ilvl w:val="0"/>
           <w:numId w:val="3"/>
@@ -4866,7 +5574,7 @@
       <w:pPr>
         <w:pStyle w:val="3"/>
       </w:pPr>
-      <w:bookmarkStart w:id="8" w:name="_Toc29080"/>
+      <w:bookmarkStart w:id="8" w:name="_Toc16370"/>
       <w:r>
         <w:t>3.2 账套数据存储</w:t>
       </w:r>
@@ -4884,7 +5592,7 @@
       <w:pPr>
         <w:pStyle w:val="3"/>
       </w:pPr>
-      <w:bookmarkStart w:id="9" w:name="_Toc15541"/>
+      <w:bookmarkStart w:id="9" w:name="_Toc27027"/>
       <w:r>
         <w:t>3.3 启动账套</w:t>
       </w:r>
@@ -4922,7 +5630,7 @@
           <w:lang w:val="en-US" w:eastAsia="zh-CN"/>
         </w:rPr>
       </w:pPr>
-      <w:bookmarkStart w:id="10" w:name="_Toc32014"/>
+      <w:bookmarkStart w:id="10" w:name="_Toc25541"/>
       <w:r>
         <w:t>3.</w:t>
       </w:r>
@@ -4997,7 +5705,7 @@
           <w:lang w:val="en-US" w:eastAsia="zh-CN"/>
         </w:rPr>
       </w:pPr>
-      <w:bookmarkStart w:id="11" w:name="_Toc7848"/>
+      <w:bookmarkStart w:id="11" w:name="_Toc17244"/>
       <w:r>
         <w:t>3.</w:t>
       </w:r>
@@ -5072,7 +5780,7 @@
           <w:lang w:val="en-US" w:eastAsia="zh-CN"/>
         </w:rPr>
       </w:pPr>
-      <w:bookmarkStart w:id="12" w:name="_Toc31449"/>
+      <w:bookmarkStart w:id="12" w:name="_Toc24512"/>
       <w:r>
         <w:t>3.</w:t>
       </w:r>
@@ -5187,7 +5895,7 @@
       <w:pPr>
         <w:pStyle w:val="2"/>
       </w:pPr>
-      <w:bookmarkStart w:id="13" w:name="_Toc10360"/>
+      <w:bookmarkStart w:id="13" w:name="_Toc10254"/>
       <w:r>
         <w:t>4. 工具箱使用</w:t>
       </w:r>
@@ -5201,7 +5909,7 @@
           <w:lang w:eastAsia="zh-CN"/>
         </w:rPr>
       </w:pPr>
-      <w:bookmarkStart w:id="14" w:name="_Toc2423"/>
+      <w:bookmarkStart w:id="14" w:name="_Toc18914"/>
       <w:bookmarkStart w:id="15" w:name="_4.1 跨库复制对象"/>
       <w:r>
         <w:t>4.1 跨库复制</w:t>
@@ -5284,7 +5992,7 @@
     </w:p>
     <w:p>
       <w:pPr>
-        <w:pStyle w:val="18"/>
+        <w:pStyle w:val="19"/>
         <w:numPr>
           <w:ilvl w:val="0"/>
           <w:numId w:val="0"/>
@@ -5304,7 +6012,7 @@
     </w:p>
     <w:p>
       <w:pPr>
-        <w:pStyle w:val="18"/>
+        <w:pStyle w:val="19"/>
         <w:numPr>
           <w:ilvl w:val="0"/>
           <w:numId w:val="0"/>
@@ -5343,7 +6051,7 @@
     </w:p>
     <w:p>
       <w:pPr>
-        <w:pStyle w:val="18"/>
+        <w:pStyle w:val="19"/>
         <w:numPr>
           <w:ilvl w:val="0"/>
           <w:numId w:val="0"/>
@@ -5363,7 +6071,7 @@
     </w:p>
     <w:p>
       <w:pPr>
-        <w:pStyle w:val="18"/>
+        <w:pStyle w:val="19"/>
         <w:numPr>
           <w:ilvl w:val="0"/>
           <w:numId w:val="0"/>
@@ -5384,7 +6092,7 @@
     </w:p>
     <w:p>
       <w:pPr>
-        <w:pStyle w:val="18"/>
+        <w:pStyle w:val="19"/>
         <w:numPr>
           <w:ilvl w:val="0"/>
           <w:numId w:val="0"/>
@@ -5425,7 +6133,7 @@
     </w:p>
     <w:p>
       <w:pPr>
-        <w:pStyle w:val="18"/>
+        <w:pStyle w:val="19"/>
         <w:numPr>
           <w:ilvl w:val="0"/>
           <w:numId w:val="0"/>
@@ -5446,7 +6154,7 @@
     </w:p>
     <w:p>
       <w:pPr>
-        <w:pStyle w:val="18"/>
+        <w:pStyle w:val="19"/>
         <w:numPr>
           <w:ilvl w:val="0"/>
           <w:numId w:val="0"/>
@@ -5467,7 +6175,7 @@
     </w:p>
     <w:p>
       <w:pPr>
-        <w:pStyle w:val="18"/>
+        <w:pStyle w:val="19"/>
         <w:numPr>
           <w:ilvl w:val="0"/>
           <w:numId w:val="0"/>
@@ -5507,7 +6215,7 @@
     </w:p>
     <w:p>
       <w:pPr>
-        <w:pStyle w:val="18"/>
+        <w:pStyle w:val="19"/>
         <w:numPr>
           <w:ilvl w:val="0"/>
           <w:numId w:val="0"/>
@@ -5528,7 +6236,7 @@
     </w:p>
     <w:p>
       <w:pPr>
-        <w:pStyle w:val="18"/>
+        <w:pStyle w:val="19"/>
         <w:numPr>
           <w:ilvl w:val="0"/>
           <w:numId w:val="0"/>
@@ -5613,7 +6321,7 @@
     </w:p>
     <w:p>
       <w:pPr>
-        <w:pStyle w:val="18"/>
+        <w:pStyle w:val="19"/>
         <w:numPr>
           <w:ilvl w:val="0"/>
           <w:numId w:val="0"/>
@@ -5623,7 +6331,7 @@
     </w:p>
     <w:p>
       <w:pPr>
-        <w:pStyle w:val="18"/>
+        <w:pStyle w:val="19"/>
         <w:numPr>
           <w:ilvl w:val="0"/>
           <w:numId w:val="0"/>
@@ -5639,7 +6347,7 @@
       <w:pPr>
         <w:pStyle w:val="3"/>
       </w:pPr>
-      <w:bookmarkStart w:id="16" w:name="_Toc22423"/>
+      <w:bookmarkStart w:id="16" w:name="_Toc15003"/>
       <w:bookmarkStart w:id="17" w:name="_4.2 跨库复制Win表单"/>
       <w:r>
         <w:t>4.2 跨库复制Win表单</w:t>
@@ -5705,7 +6413,7 @@
     </w:p>
     <w:p>
       <w:pPr>
-        <w:pStyle w:val="18"/>
+        <w:pStyle w:val="19"/>
         <w:numPr>
           <w:ilvl w:val="0"/>
           <w:numId w:val="0"/>
@@ -5725,7 +6433,7 @@
     </w:p>
     <w:p>
       <w:pPr>
-        <w:pStyle w:val="18"/>
+        <w:pStyle w:val="19"/>
         <w:numPr>
           <w:ilvl w:val="0"/>
           <w:numId w:val="0"/>
@@ -5745,7 +6453,7 @@
     </w:p>
     <w:p>
       <w:pPr>
-        <w:pStyle w:val="18"/>
+        <w:pStyle w:val="19"/>
         <w:numPr>
           <w:ilvl w:val="0"/>
           <w:numId w:val="0"/>
@@ -5765,7 +6473,7 @@
     </w:p>
     <w:p>
       <w:pPr>
-        <w:pStyle w:val="18"/>
+        <w:pStyle w:val="19"/>
         <w:numPr>
           <w:ilvl w:val="0"/>
           <w:numId w:val="0"/>
@@ -5796,7 +6504,7 @@
     </w:p>
     <w:p>
       <w:pPr>
-        <w:pStyle w:val="18"/>
+        <w:pStyle w:val="19"/>
         <w:numPr>
           <w:ilvl w:val="0"/>
           <w:numId w:val="0"/>
@@ -5817,7 +6525,7 @@
     </w:p>
     <w:p>
       <w:pPr>
-        <w:pStyle w:val="18"/>
+        <w:pStyle w:val="19"/>
         <w:numPr>
           <w:ilvl w:val="0"/>
           <w:numId w:val="0"/>
@@ -5838,7 +6546,7 @@
     </w:p>
     <w:p>
       <w:pPr>
-        <w:pStyle w:val="18"/>
+        <w:pStyle w:val="19"/>
         <w:numPr>
           <w:ilvl w:val="0"/>
           <w:numId w:val="0"/>
@@ -5859,7 +6567,7 @@
     </w:p>
     <w:p>
       <w:pPr>
-        <w:pStyle w:val="18"/>
+        <w:pStyle w:val="19"/>
         <w:numPr>
           <w:ilvl w:val="0"/>
           <w:numId w:val="0"/>
@@ -5970,7 +6678,7 @@
     </w:p>
     <w:p>
       <w:pPr>
-        <w:pStyle w:val="18"/>
+        <w:pStyle w:val="19"/>
         <w:numPr>
           <w:ilvl w:val="0"/>
           <w:numId w:val="0"/>
@@ -5997,7 +6705,7 @@
       <w:pPr>
         <w:pStyle w:val="3"/>
       </w:pPr>
-      <w:bookmarkStart w:id="18" w:name="_Toc19922"/>
+      <w:bookmarkStart w:id="18" w:name="_Toc21124"/>
       <w:bookmarkStart w:id="19" w:name="_4.3 跨库复制APP表单"/>
       <w:r>
         <w:t>4.3 跨库复制APP表单</w:t>
@@ -6085,7 +6793,7 @@
     </w:p>
     <w:p>
       <w:pPr>
-        <w:pStyle w:val="18"/>
+        <w:pStyle w:val="19"/>
         <w:numPr>
           <w:ilvl w:val="0"/>
           <w:numId w:val="0"/>
@@ -6105,7 +6813,7 @@
     </w:p>
     <w:p>
       <w:pPr>
-        <w:pStyle w:val="18"/>
+        <w:pStyle w:val="19"/>
         <w:numPr>
           <w:ilvl w:val="0"/>
           <w:numId w:val="0"/>
@@ -6249,7 +6957,7 @@
         <w:pStyle w:val="3"/>
         <w:bidi w:val="0"/>
       </w:pPr>
-      <w:bookmarkStart w:id="20" w:name="_Toc28030"/>
+      <w:bookmarkStart w:id="20" w:name="_Toc18041"/>
       <w:bookmarkStart w:id="21" w:name="_4.4 跨库复制单据流转"/>
       <w:r>
         <w:t>4.4 跨库复制单据流转</w:t>
@@ -6331,7 +7039,7 @@
     </w:p>
     <w:p>
       <w:pPr>
-        <w:pStyle w:val="18"/>
+        <w:pStyle w:val="19"/>
         <w:numPr>
           <w:ilvl w:val="0"/>
           <w:numId w:val="0"/>
@@ -6357,7 +7065,7 @@
     </w:p>
     <w:p>
       <w:pPr>
-        <w:pStyle w:val="18"/>
+        <w:pStyle w:val="19"/>
         <w:numPr>
           <w:ilvl w:val="0"/>
           <w:numId w:val="0"/>
@@ -6389,7 +7097,7 @@
         <w:pStyle w:val="3"/>
         <w:bidi w:val="0"/>
       </w:pPr>
-      <w:bookmarkStart w:id="22" w:name="_Toc23248"/>
+      <w:bookmarkStart w:id="22" w:name="_Toc2494"/>
       <w:bookmarkStart w:id="23" w:name="_4.5 跨库复制报表"/>
       <w:r>
         <w:t>4.5 跨库复制报表</w:t>
@@ -6471,7 +7179,7 @@
     </w:p>
     <w:p>
       <w:pPr>
-        <w:pStyle w:val="18"/>
+        <w:pStyle w:val="19"/>
         <w:numPr>
           <w:ilvl w:val="0"/>
           <w:numId w:val="0"/>
@@ -6497,7 +7205,7 @@
     </w:p>
     <w:p>
       <w:pPr>
-        <w:pStyle w:val="18"/>
+        <w:pStyle w:val="19"/>
         <w:numPr>
           <w:ilvl w:val="0"/>
           <w:numId w:val="0"/>
@@ -6533,7 +7241,7 @@
           <w:lang w:val="en-US" w:eastAsia="zh-CN"/>
         </w:rPr>
       </w:pPr>
-      <w:bookmarkStart w:id="24" w:name="_Toc29577"/>
+      <w:bookmarkStart w:id="24" w:name="_Toc11252"/>
       <w:bookmarkStart w:id="25" w:name="_4.6 搜索后台表单"/>
       <w:r>
         <w:rPr>
@@ -6676,7 +7384,7 @@
           <w:lang w:val="en-US" w:eastAsia="zh-CN"/>
         </w:rPr>
       </w:pPr>
-      <w:bookmarkStart w:id="26" w:name="_Toc30273"/>
+      <w:bookmarkStart w:id="26" w:name="_Toc25842"/>
       <w:bookmarkStart w:id="27" w:name="_4.7 搜索前台菜单"/>
       <w:r>
         <w:rPr>
@@ -6820,7 +7528,7 @@
           <w:lang w:val="en-US" w:eastAsia="zh-CN"/>
         </w:rPr>
       </w:pPr>
-      <w:bookmarkStart w:id="28" w:name="_Toc31391"/>
+      <w:bookmarkStart w:id="28" w:name="_Toc28678"/>
       <w:bookmarkStart w:id="29" w:name="_4.8 跨库复制WEB看板"/>
       <w:r>
         <w:t>4.</w:t>
@@ -6955,7 +7663,7 @@
     </w:p>
     <w:p>
       <w:pPr>
-        <w:pStyle w:val="18"/>
+        <w:pStyle w:val="19"/>
         <w:numPr>
           <w:ilvl w:val="0"/>
           <w:numId w:val="0"/>
@@ -6975,7 +7683,7 @@
     </w:p>
     <w:p>
       <w:pPr>
-        <w:pStyle w:val="18"/>
+        <w:pStyle w:val="19"/>
         <w:numPr>
           <w:ilvl w:val="0"/>
           <w:numId w:val="0"/>
@@ -7121,7 +7829,7 @@
           <w:lang w:val="en-US" w:eastAsia="zh-CN"/>
         </w:rPr>
       </w:pPr>
-      <w:bookmarkStart w:id="30" w:name="_Toc11873"/>
+      <w:bookmarkStart w:id="30" w:name="_Toc11727"/>
       <w:bookmarkStart w:id="31" w:name="_4.9 跨库复制移动看板"/>
       <w:r>
         <w:t>4.</w:t>
@@ -7256,7 +7964,7 @@
     </w:p>
     <w:p>
       <w:pPr>
-        <w:pStyle w:val="18"/>
+        <w:pStyle w:val="19"/>
         <w:numPr>
           <w:ilvl w:val="0"/>
           <w:numId w:val="0"/>
@@ -7276,7 +7984,7 @@
     </w:p>
     <w:p>
       <w:pPr>
-        <w:pStyle w:val="18"/>
+        <w:pStyle w:val="19"/>
         <w:numPr>
           <w:ilvl w:val="0"/>
           <w:numId w:val="0"/>
@@ -7438,7 +8146,7 @@
           <w:lang w:val="en-US" w:eastAsia="zh-CN"/>
         </w:rPr>
       </w:pPr>
-      <w:bookmarkStart w:id="32" w:name="_Toc23865"/>
+      <w:bookmarkStart w:id="32" w:name="_Toc5079"/>
       <w:bookmarkStart w:id="33" w:name="_4.10 跨库复制配置数据"/>
       <w:r>
         <w:t>4.1</w:t>
@@ -7531,7 +8239,7 @@
     </w:p>
     <w:p>
       <w:pPr>
-        <w:pStyle w:val="18"/>
+        <w:pStyle w:val="19"/>
         <w:numPr>
           <w:ilvl w:val="0"/>
           <w:numId w:val="0"/>
@@ -7551,7 +8259,7 @@
     </w:p>
     <w:p>
       <w:pPr>
-        <w:pStyle w:val="18"/>
+        <w:pStyle w:val="19"/>
         <w:numPr>
           <w:ilvl w:val="0"/>
           <w:numId w:val="0"/>
@@ -7590,7 +8298,7 @@
     </w:p>
     <w:p>
       <w:pPr>
-        <w:pStyle w:val="18"/>
+        <w:pStyle w:val="19"/>
         <w:numPr>
           <w:ilvl w:val="0"/>
           <w:numId w:val="0"/>
@@ -7610,7 +8318,7 @@
     </w:p>
     <w:p>
       <w:pPr>
-        <w:pStyle w:val="18"/>
+        <w:pStyle w:val="19"/>
         <w:numPr>
           <w:ilvl w:val="0"/>
           <w:numId w:val="0"/>
@@ -7631,7 +8339,7 @@
     </w:p>
     <w:p>
       <w:pPr>
-        <w:pStyle w:val="18"/>
+        <w:pStyle w:val="19"/>
         <w:numPr>
           <w:ilvl w:val="0"/>
           <w:numId w:val="0"/>
@@ -7672,7 +8380,7 @@
     </w:p>
     <w:p>
       <w:pPr>
-        <w:pStyle w:val="18"/>
+        <w:pStyle w:val="19"/>
         <w:numPr>
           <w:ilvl w:val="0"/>
           <w:numId w:val="0"/>
@@ -7693,7 +8401,7 @@
     </w:p>
     <w:p>
       <w:pPr>
-        <w:pStyle w:val="18"/>
+        <w:pStyle w:val="19"/>
         <w:numPr>
           <w:ilvl w:val="0"/>
           <w:numId w:val="0"/>
@@ -7714,7 +8422,7 @@
     </w:p>
     <w:p>
       <w:pPr>
-        <w:pStyle w:val="18"/>
+        <w:pStyle w:val="19"/>
         <w:numPr>
           <w:ilvl w:val="0"/>
           <w:numId w:val="0"/>
@@ -7772,31 +8480,326 @@
       <w:pPr>
         <w:ind w:firstLine="440" w:firstLineChars="200"/>
         <w:rPr>
+          <w:rFonts w:hint="eastAsia"/>
+          <w:lang w:val="en-US" w:eastAsia="zh-CN"/>
+        </w:rPr>
+      </w:pPr>
+      <w:r>
+        <w:rPr>
+          <w:rFonts w:hint="eastAsia"/>
+          <w:lang w:val="en-US" w:eastAsia="zh-CN"/>
+        </w:rPr>
+        <w:t>9.查询后可以通过过滤框二次过滤</w:t>
+      </w:r>
+    </w:p>
+    <w:p>
+      <w:pPr>
+        <w:rPr>
+          <w:rFonts w:hint="eastAsia"/>
+          <w:lang w:val="en-US" w:eastAsia="zh-CN"/>
+        </w:rPr>
+      </w:pPr>
+    </w:p>
+    <w:p>
+      <w:pPr>
+        <w:pStyle w:val="3"/>
+        <w:rPr>
           <w:rFonts w:hint="default"/>
-          <w:lang w:val="en-US" w:eastAsia="zh-CN"/>
-        </w:rPr>
-      </w:pPr>
-      <w:r>
-        <w:rPr>
-          <w:rFonts w:hint="eastAsia"/>
-          <w:lang w:val="en-US" w:eastAsia="zh-CN"/>
-        </w:rPr>
-        <w:t>9.查询后可以通过过滤框二次过滤</w:t>
-      </w:r>
-    </w:p>
-    <w:p>
-      <w:pPr>
+          <w:lang w:val="en-US"/>
+        </w:rPr>
+      </w:pPr>
+      <w:bookmarkStart w:id="34" w:name="_Toc3653"/>
+      <w:bookmarkStart w:id="35" w:name="_4.12自定义工具"/>
+      <w:r>
+        <w:t>4.</w:t>
+      </w:r>
+      <w:r>
+        <w:rPr>
+          <w:rFonts w:hint="eastAsia"/>
+          <w:lang w:val="en-US" w:eastAsia="zh-CN"/>
+        </w:rPr>
+        <w:t>12自定义工具</w:t>
+      </w:r>
+      <w:bookmarkEnd w:id="34"/>
+    </w:p>
+    <w:bookmarkEnd w:id="35"/>
+    <w:p>
+      <w:pPr>
+        <w:pStyle w:val="19"/>
+        <w:numPr>
+          <w:ilvl w:val="0"/>
+          <w:numId w:val="0"/>
+        </w:numPr>
+      </w:pPr>
+      <w:r>
+        <w:drawing>
+          <wp:inline distT="0" distB="0" distL="114300" distR="114300">
+            <wp:extent cx="6176010" cy="3277870"/>
+            <wp:effectExtent l="0" t="0" r="9525" b="3810"/>
+            <wp:docPr id="17" name="图片 1"/>
+            <wp:cNvGraphicFramePr>
+              <a:graphicFrameLocks xmlns:a="http://schemas.openxmlformats.org/drawingml/2006/main" noChangeAspect="1"/>
+            </wp:cNvGraphicFramePr>
+            <a:graphic xmlns:a="http://schemas.openxmlformats.org/drawingml/2006/main">
+              <a:graphicData uri="http://schemas.openxmlformats.org/drawingml/2006/picture">
+                <pic:pic xmlns:pic="http://schemas.openxmlformats.org/drawingml/2006/picture">
+                  <pic:nvPicPr>
+                    <pic:cNvPr id="17" name="图片 1"/>
+                    <pic:cNvPicPr>
+                      <a:picLocks noChangeAspect="1"/>
+                    </pic:cNvPicPr>
+                  </pic:nvPicPr>
+                  <pic:blipFill>
+                    <a:blip r:embed="rId22"/>
+                    <a:stretch>
+                      <a:fillRect/>
+                    </a:stretch>
+                  </pic:blipFill>
+                  <pic:spPr>
+                    <a:xfrm>
+                      <a:off x="0" y="0"/>
+                      <a:ext cx="6176010" cy="3277870"/>
+                    </a:xfrm>
+                    <a:prstGeom prst="rect">
+                      <a:avLst/>
+                    </a:prstGeom>
+                    <a:noFill/>
+                    <a:ln>
+                      <a:noFill/>
+                    </a:ln>
+                  </pic:spPr>
+                </pic:pic>
+              </a:graphicData>
+            </a:graphic>
+          </wp:inline>
+        </w:drawing>
+      </w:r>
+    </w:p>
+    <w:p>
+      <w:pPr>
+        <w:pStyle w:val="19"/>
+        <w:numPr>
+          <w:ilvl w:val="0"/>
+          <w:numId w:val="0"/>
+        </w:numPr>
+      </w:pPr>
+    </w:p>
+    <w:p>
+      <w:pPr>
+        <w:pStyle w:val="19"/>
+        <w:numPr>
+          <w:ilvl w:val="0"/>
+          <w:numId w:val="0"/>
+        </w:numPr>
+        <w:rPr>
+          <w:rFonts w:hint="eastAsia"/>
+          <w:lang w:val="en-US" w:eastAsia="zh-CN"/>
+        </w:rPr>
+      </w:pPr>
+      <w:r>
+        <w:rPr>
+          <w:rFonts w:hint="eastAsia"/>
+          <w:lang w:val="en-US" w:eastAsia="zh-CN"/>
+        </w:rPr>
+        <w:t>1、点击自定义工具</w:t>
+      </w:r>
+      <w:r>
+        <w:t>，</w:t>
+      </w:r>
+      <w:r>
+        <w:rPr>
+          <w:rFonts w:hint="eastAsia"/>
+          <w:lang w:val="en-US" w:eastAsia="zh-CN"/>
+        </w:rPr>
+        <w:t>填写对应信息，点击确定创建对应自定义工具</w:t>
+      </w:r>
+    </w:p>
+    <w:p>
+      <w:pPr>
+        <w:pStyle w:val="19"/>
+        <w:numPr>
+          <w:ilvl w:val="0"/>
+          <w:numId w:val="0"/>
+        </w:numPr>
+        <w:rPr>
+          <w:rFonts w:hint="eastAsia"/>
+          <w:lang w:val="en-US" w:eastAsia="zh-CN"/>
+        </w:rPr>
+      </w:pPr>
+      <w:r>
+        <w:rPr>
+          <w:rFonts w:hint="eastAsia"/>
+          <w:lang w:val="en-US" w:eastAsia="zh-CN"/>
+        </w:rPr>
+        <w:t>2、如需要跨库复制报表功能，先从IDE中找到报表录入表单，查看对应数据源</w:t>
+      </w:r>
+    </w:p>
+    <w:p>
+      <w:pPr>
+        <w:pStyle w:val="19"/>
+        <w:numPr>
+          <w:ilvl w:val="0"/>
+          <w:numId w:val="0"/>
+        </w:numPr>
+        <w:rPr>
+          <w:rFonts w:hint="eastAsia"/>
+          <w:lang w:val="en-US" w:eastAsia="zh-CN"/>
+        </w:rPr>
+      </w:pPr>
+      <w:r>
+        <w:rPr>
+          <w:rFonts w:hint="eastAsia"/>
+          <w:lang w:val="en-US" w:eastAsia="zh-CN"/>
+        </w:rPr>
+        <w:t>3、主表对应数据源中主数据源表名</w:t>
+      </w:r>
+    </w:p>
+    <w:p>
+      <w:pPr>
+        <w:pStyle w:val="19"/>
+        <w:numPr>
+          <w:ilvl w:val="0"/>
+          <w:numId w:val="0"/>
+        </w:numPr>
         <w:rPr>
           <w:rFonts w:hint="default"/>
           <w:lang w:val="en-US" w:eastAsia="zh-CN"/>
         </w:rPr>
       </w:pPr>
+      <w:r>
+        <w:rPr>
+          <w:rFonts w:hint="eastAsia"/>
+          <w:lang w:val="en-US" w:eastAsia="zh-CN"/>
+        </w:rPr>
+        <w:t>4、关联表非主数据源里表名多个用英文分号隔开</w:t>
+      </w:r>
+    </w:p>
+    <w:p>
+      <w:pPr>
+        <w:rPr>
+          <w:rFonts w:hint="eastAsia"/>
+          <w:lang w:val="en-US" w:eastAsia="zh-CN"/>
+        </w:rPr>
+      </w:pPr>
+      <w:r>
+        <w:rPr>
+          <w:rFonts w:hint="eastAsia"/>
+          <w:lang w:val="en-US" w:eastAsia="zh-CN"/>
+        </w:rPr>
+        <w:t>5、关联字段 填写数据关系中关联字段</w:t>
+      </w:r>
+    </w:p>
+    <w:p>
+      <w:r>
+        <w:drawing>
+          <wp:inline distT="0" distB="0" distL="114300" distR="114300">
+            <wp:extent cx="6179820" cy="3670300"/>
+            <wp:effectExtent l="0" t="0" r="5715" b="0"/>
+            <wp:docPr id="19" name="图片 2"/>
+            <wp:cNvGraphicFramePr>
+              <a:graphicFrameLocks xmlns:a="http://schemas.openxmlformats.org/drawingml/2006/main" noChangeAspect="1"/>
+            </wp:cNvGraphicFramePr>
+            <a:graphic xmlns:a="http://schemas.openxmlformats.org/drawingml/2006/main">
+              <a:graphicData uri="http://schemas.openxmlformats.org/drawingml/2006/picture">
+                <pic:pic xmlns:pic="http://schemas.openxmlformats.org/drawingml/2006/picture">
+                  <pic:nvPicPr>
+                    <pic:cNvPr id="19" name="图片 2"/>
+                    <pic:cNvPicPr>
+                      <a:picLocks noChangeAspect="1"/>
+                    </pic:cNvPicPr>
+                  </pic:nvPicPr>
+                  <pic:blipFill>
+                    <a:blip r:embed="rId23"/>
+                    <a:stretch>
+                      <a:fillRect/>
+                    </a:stretch>
+                  </pic:blipFill>
+                  <pic:spPr>
+                    <a:xfrm>
+                      <a:off x="0" y="0"/>
+                      <a:ext cx="6179820" cy="3670300"/>
+                    </a:xfrm>
+                    <a:prstGeom prst="rect">
+                      <a:avLst/>
+                    </a:prstGeom>
+                    <a:noFill/>
+                    <a:ln>
+                      <a:noFill/>
+                    </a:ln>
+                  </pic:spPr>
+                </pic:pic>
+              </a:graphicData>
+            </a:graphic>
+          </wp:inline>
+        </w:drawing>
+      </w:r>
+    </w:p>
+    <w:p>
+      <w:r>
+        <w:drawing>
+          <wp:inline distT="0" distB="0" distL="114300" distR="114300">
+            <wp:extent cx="6171565" cy="3734435"/>
+            <wp:effectExtent l="0" t="0" r="3175" b="635"/>
+            <wp:docPr id="20" name="图片 3"/>
+            <wp:cNvGraphicFramePr>
+              <a:graphicFrameLocks xmlns:a="http://schemas.openxmlformats.org/drawingml/2006/main" noChangeAspect="1"/>
+            </wp:cNvGraphicFramePr>
+            <a:graphic xmlns:a="http://schemas.openxmlformats.org/drawingml/2006/main">
+              <a:graphicData uri="http://schemas.openxmlformats.org/drawingml/2006/picture">
+                <pic:pic xmlns:pic="http://schemas.openxmlformats.org/drawingml/2006/picture">
+                  <pic:nvPicPr>
+                    <pic:cNvPr id="20" name="图片 3"/>
+                    <pic:cNvPicPr>
+                      <a:picLocks noChangeAspect="1"/>
+                    </pic:cNvPicPr>
+                  </pic:nvPicPr>
+                  <pic:blipFill>
+                    <a:blip r:embed="rId24"/>
+                    <a:stretch>
+                      <a:fillRect/>
+                    </a:stretch>
+                  </pic:blipFill>
+                  <pic:spPr>
+                    <a:xfrm>
+                      <a:off x="0" y="0"/>
+                      <a:ext cx="6171565" cy="3734435"/>
+                    </a:xfrm>
+                    <a:prstGeom prst="rect">
+                      <a:avLst/>
+                    </a:prstGeom>
+                    <a:noFill/>
+                    <a:ln>
+                      <a:noFill/>
+                    </a:ln>
+                  </pic:spPr>
+                </pic:pic>
+              </a:graphicData>
+            </a:graphic>
+          </wp:inline>
+        </w:drawing>
+      </w:r>
+    </w:p>
+    <w:p>
+      <w:pPr>
+        <w:rPr>
+          <w:rFonts w:hint="default"/>
+          <w:lang w:val="en-US" w:eastAsia="zh-CN"/>
+        </w:rPr>
+      </w:pPr>
+    </w:p>
+    <w:p>
+      <w:pPr>
+        <w:rPr>
+          <w:rFonts w:hint="default"/>
+          <w:lang w:val="en-US" w:eastAsia="zh-CN"/>
+        </w:rPr>
+      </w:pPr>
     </w:p>
     <w:p>
       <w:pPr>
         <w:pStyle w:val="3"/>
       </w:pPr>
-      <w:bookmarkStart w:id="34" w:name="_Toc3145"/>
+      <w:bookmarkStart w:id="36" w:name="_Toc14679"/>
       <w:r>
         <w:t>4.</w:t>
       </w:r>
@@ -7805,12 +8808,12 @@
           <w:rFonts w:hint="eastAsia"/>
           <w:lang w:val="en-US" w:eastAsia="zh-CN"/>
         </w:rPr>
-        <w:t>11</w:t>
+        <w:t>13</w:t>
       </w:r>
       <w:r>
         <w:t>工具扩展</w:t>
       </w:r>
-      <w:bookmarkEnd w:id="34"/>
+      <w:bookmarkEnd w:id="36"/>
     </w:p>
     <w:p>
       <w:pPr>
@@ -7829,7 +8832,7 @@
       <w:pPr>
         <w:pStyle w:val="2"/>
       </w:pPr>
-      <w:bookmarkStart w:id="35" w:name="_Toc16004"/>
+      <w:bookmarkStart w:id="37" w:name="_Toc18753"/>
       <w:r>
         <w:rPr>
           <w:rFonts w:hint="eastAsia"/>
@@ -7840,13 +8843,13 @@
       <w:r>
         <w:t>. 系统托盘与快捷键</w:t>
       </w:r>
-      <w:bookmarkEnd w:id="35"/>
+      <w:bookmarkEnd w:id="37"/>
     </w:p>
     <w:p>
       <w:pPr>
         <w:pStyle w:val="3"/>
       </w:pPr>
-      <w:bookmarkStart w:id="36" w:name="_Toc21249"/>
+      <w:bookmarkStart w:id="38" w:name="_Toc1423"/>
       <w:r>
         <w:rPr>
           <w:rFonts w:hint="eastAsia"/>
@@ -7857,7 +8860,7 @@
       <w:r>
         <w:t>.1 自动隐藏到托盘</w:t>
       </w:r>
-      <w:bookmarkEnd w:id="36"/>
+      <w:bookmarkEnd w:id="38"/>
     </w:p>
     <w:p>
       <w:pPr>
@@ -7871,7 +8874,7 @@
       <w:pPr>
         <w:pStyle w:val="3"/>
       </w:pPr>
-      <w:bookmarkStart w:id="37" w:name="_Toc6066"/>
+      <w:bookmarkStart w:id="39" w:name="_Toc28208"/>
       <w:r>
         <w:rPr>
           <w:rFonts w:hint="eastAsia"/>
@@ -7882,7 +8885,7 @@
       <w:r>
         <w:t>.2 从托盘恢复</w:t>
       </w:r>
-      <w:bookmarkEnd w:id="37"/>
+      <w:bookmarkEnd w:id="39"/>
     </w:p>
     <w:p>
       <w:pPr>
@@ -7896,7 +8899,7 @@
       <w:pPr>
         <w:pStyle w:val="3"/>
       </w:pPr>
-      <w:bookmarkStart w:id="38" w:name="_Toc30741"/>
+      <w:bookmarkStart w:id="40" w:name="_Toc30366"/>
       <w:r>
         <w:rPr>
           <w:rFonts w:hint="eastAsia"/>
@@ -7907,7 +8910,7 @@
       <w:r>
         <w:t>.3 托盘快捷键</w:t>
       </w:r>
-      <w:bookmarkEnd w:id="38"/>
+      <w:bookmarkEnd w:id="40"/>
     </w:p>
     <w:p>
       <w:pPr>
@@ -7941,7 +8944,7 @@
       <w:pPr>
         <w:pStyle w:val="2"/>
       </w:pPr>
-      <w:bookmarkStart w:id="39" w:name="_Toc27832"/>
+      <w:bookmarkStart w:id="41" w:name="_Toc21119"/>
       <w:r>
         <w:rPr>
           <w:rFonts w:hint="eastAsia"/>
@@ -7952,13 +8955,13 @@
       <w:r>
         <w:t>. Root模式</w:t>
       </w:r>
-      <w:bookmarkEnd w:id="39"/>
+      <w:bookmarkEnd w:id="41"/>
     </w:p>
     <w:p>
       <w:pPr>
         <w:pStyle w:val="3"/>
       </w:pPr>
-      <w:bookmarkStart w:id="40" w:name="_Toc10713"/>
+      <w:bookmarkStart w:id="42" w:name="_Toc26392"/>
       <w:r>
         <w:rPr>
           <w:rFonts w:hint="eastAsia"/>
@@ -7969,7 +8972,7 @@
       <w:r>
         <w:t>.1 进入Root模式</w:t>
       </w:r>
-      <w:bookmarkEnd w:id="40"/>
+      <w:bookmarkEnd w:id="42"/>
     </w:p>
     <w:p>
       <w:pPr>
@@ -8010,7 +9013,7 @@
       <w:pPr>
         <w:pStyle w:val="3"/>
       </w:pPr>
-      <w:bookmarkStart w:id="41" w:name="_Toc19463"/>
+      <w:bookmarkStart w:id="43" w:name="_Toc15619"/>
       <w:r>
         <w:rPr>
           <w:rFonts w:hint="eastAsia"/>
@@ -8021,7 +9024,7 @@
       <w:r>
         <w:t>.2 查看明文密码</w:t>
       </w:r>
-      <w:bookmarkEnd w:id="41"/>
+      <w:bookmarkEnd w:id="43"/>
     </w:p>
     <w:p>
       <w:pPr>
@@ -8039,7 +9042,7 @@
           <w:lang w:val="en-US" w:eastAsia="zh-CN"/>
         </w:rPr>
       </w:pPr>
-      <w:bookmarkStart w:id="42" w:name="_Toc6334"/>
+      <w:bookmarkStart w:id="44" w:name="_Toc11857"/>
       <w:r>
         <w:rPr>
           <w:rFonts w:hint="eastAsia"/>
@@ -8067,7 +9070,7 @@
         </w:rPr>
         <w:t>复制账套信息</w:t>
       </w:r>
-      <w:bookmarkEnd w:id="42"/>
+      <w:bookmarkEnd w:id="44"/>
     </w:p>
     <w:p>
       <w:pPr>
@@ -8096,7 +9099,7 @@
       <w:pPr>
         <w:pStyle w:val="2"/>
       </w:pPr>
-      <w:bookmarkStart w:id="43" w:name="_Toc6402"/>
+      <w:bookmarkStart w:id="45" w:name="_Toc13995"/>
       <w:r>
         <w:rPr>
           <w:rFonts w:hint="eastAsia"/>
@@ -8107,13 +9110,13 @@
       <w:r>
         <w:t>. 一键启动</w:t>
       </w:r>
-      <w:bookmarkEnd w:id="43"/>
+      <w:bookmarkEnd w:id="45"/>
     </w:p>
     <w:p>
       <w:pPr>
         <w:pStyle w:val="3"/>
       </w:pPr>
-      <w:bookmarkStart w:id="44" w:name="_Toc9322"/>
+      <w:bookmarkStart w:id="46" w:name="_Toc10368"/>
       <w:r>
         <w:rPr>
           <w:rFonts w:hint="eastAsia"/>
@@ -8124,7 +9127,7 @@
       <w:r>
         <w:t>.1 启动选项</w:t>
       </w:r>
-      <w:bookmarkEnd w:id="44"/>
+      <w:bookmarkEnd w:id="46"/>
     </w:p>
     <w:p>
       <w:pPr>
@@ -8154,7 +9157,7 @@
       <w:pPr>
         <w:pStyle w:val="3"/>
       </w:pPr>
-      <w:bookmarkStart w:id="45" w:name="_Toc24389"/>
+      <w:bookmarkStart w:id="47" w:name="_Toc4934"/>
       <w:r>
         <w:rPr>
           <w:rFonts w:hint="eastAsia"/>
@@ -8165,7 +9168,7 @@
       <w:r>
         <w:t>.2 浏览器选择</w:t>
       </w:r>
-      <w:bookmarkEnd w:id="45"/>
+      <w:bookmarkEnd w:id="47"/>
     </w:p>
     <w:p>
       <w:pPr>
@@ -8179,7 +9182,7 @@
       <w:pPr>
         <w:pStyle w:val="3"/>
       </w:pPr>
-      <w:bookmarkStart w:id="46" w:name="_Toc21103"/>
+      <w:bookmarkStart w:id="48" w:name="_Toc12117"/>
       <w:r>
         <w:rPr>
           <w:rFonts w:hint="eastAsia"/>
@@ -8190,7 +9193,7 @@
       <w:r>
         <w:t>.3 新窗口/新Tab</w:t>
       </w:r>
-      <w:bookmarkEnd w:id="46"/>
+      <w:bookmarkEnd w:id="48"/>
     </w:p>
     <w:p>
       <w:pPr>
@@ -8204,7 +9207,7 @@
       <w:pPr>
         <w:pStyle w:val="3"/>
       </w:pPr>
-      <w:bookmarkStart w:id="47" w:name="_Toc7411"/>
+      <w:bookmarkStart w:id="49" w:name="_Toc11898"/>
       <w:r>
         <w:rPr>
           <w:rFonts w:hint="eastAsia"/>
@@ -8215,7 +9218,7 @@
       <w:r>
         <w:t>.4 快捷启动按钮</w:t>
       </w:r>
-      <w:bookmarkEnd w:id="47"/>
+      <w:bookmarkEnd w:id="49"/>
     </w:p>
     <w:p>
       <w:pPr>
@@ -8229,7 +9232,7 @@
       <w:pPr>
         <w:pStyle w:val="2"/>
       </w:pPr>
-      <w:bookmarkStart w:id="48" w:name="_Toc25554"/>
+      <w:bookmarkStart w:id="50" w:name="_Toc15813"/>
       <w:r>
         <w:rPr>
           <w:rFonts w:hint="eastAsia"/>
@@ -8240,13 +9243,13 @@
       <w:r>
         <w:t>. 数据库连接与远程访问</w:t>
       </w:r>
-      <w:bookmarkEnd w:id="48"/>
+      <w:bookmarkEnd w:id="50"/>
     </w:p>
     <w:p>
       <w:pPr>
         <w:pStyle w:val="3"/>
       </w:pPr>
-      <w:bookmarkStart w:id="49" w:name="_Toc9382"/>
+      <w:bookmarkStart w:id="51" w:name="_Toc5541"/>
       <w:r>
         <w:rPr>
           <w:rFonts w:hint="eastAsia"/>
@@ -8257,7 +9260,7 @@
       <w:r>
         <w:t>.1 启动SSMS</w:t>
       </w:r>
-      <w:bookmarkEnd w:id="49"/>
+      <w:bookmarkEnd w:id="51"/>
     </w:p>
     <w:p>
       <w:pPr>
@@ -8271,7 +9274,7 @@
       <w:pPr>
         <w:pStyle w:val="3"/>
       </w:pPr>
-      <w:bookmarkStart w:id="50" w:name="_Toc18375"/>
+      <w:bookmarkStart w:id="52" w:name="_Toc14576"/>
       <w:r>
         <w:rPr>
           <w:rFonts w:hint="eastAsia"/>
@@ -8282,7 +9285,7 @@
       <w:r>
         <w:t>.2 RDP远程桌面</w:t>
       </w:r>
-      <w:bookmarkEnd w:id="50"/>
+      <w:bookmarkEnd w:id="52"/>
     </w:p>
     <w:p>
       <w:pPr>
@@ -8296,7 +9299,7 @@
       <w:pPr>
         <w:pStyle w:val="3"/>
       </w:pPr>
-      <w:bookmarkStart w:id="51" w:name="_Toc31675"/>
+      <w:bookmarkStart w:id="53" w:name="_Toc22970"/>
       <w:r>
         <w:rPr>
           <w:rFonts w:hint="eastAsia"/>
@@ -8307,7 +9310,7 @@
       <w:r>
         <w:t>.3 向日葵</w:t>
       </w:r>
-      <w:bookmarkEnd w:id="51"/>
+      <w:bookmarkEnd w:id="53"/>
     </w:p>
     <w:p>
       <w:pPr>
@@ -8321,7 +9324,7 @@
       <w:pPr>
         <w:pStyle w:val="2"/>
       </w:pPr>
-      <w:bookmarkStart w:id="52" w:name="_Toc23882"/>
+      <w:bookmarkStart w:id="54" w:name="_Toc29963"/>
       <w:r>
         <w:rPr>
           <w:rFonts w:hint="eastAsia"/>
@@ -8332,13 +9335,13 @@
       <w:r>
         <w:t>. 设置</w:t>
       </w:r>
-      <w:bookmarkEnd w:id="52"/>
+      <w:bookmarkEnd w:id="54"/>
     </w:p>
     <w:p>
       <w:pPr>
         <w:pStyle w:val="3"/>
       </w:pPr>
-      <w:bookmarkStart w:id="53" w:name="_Toc7"/>
+      <w:bookmarkStart w:id="55" w:name="_Toc4352"/>
       <w:r>
         <w:rPr>
           <w:rFonts w:hint="eastAsia"/>
@@ -8349,7 +9352,7 @@
       <w:r>
         <w:t>.1 应用程序目录</w:t>
       </w:r>
-      <w:bookmarkEnd w:id="53"/>
+      <w:bookmarkEnd w:id="55"/>
     </w:p>
     <w:p>
       <w:pPr>
@@ -8363,7 +9366,7 @@
       <w:pPr>
         <w:pStyle w:val="3"/>
       </w:pPr>
-      <w:bookmarkStart w:id="54" w:name="_Toc17022"/>
+      <w:bookmarkStart w:id="56" w:name="_Toc32406"/>
       <w:r>
         <w:rPr>
           <w:rFonts w:hint="eastAsia"/>
@@ -8374,7 +9377,7 @@
       <w:r>
         <w:t>.2 数据库管理器路径</w:t>
       </w:r>
-      <w:bookmarkEnd w:id="54"/>
+      <w:bookmarkEnd w:id="56"/>
     </w:p>
     <w:p>
       <w:pPr>
@@ -8388,7 +9391,7 @@
       <w:pPr>
         <w:pStyle w:val="3"/>
       </w:pPr>
-      <w:bookmarkStart w:id="55" w:name="_Toc14401"/>
+      <w:bookmarkStart w:id="57" w:name="_Toc4068"/>
       <w:r>
         <w:rPr>
           <w:rFonts w:hint="eastAsia"/>
@@ -8399,7 +9402,7 @@
       <w:r>
         <w:t>.3 启动选项</w:t>
       </w:r>
-      <w:bookmarkEnd w:id="55"/>
+      <w:bookmarkEnd w:id="57"/>
     </w:p>
     <w:p>
       <w:pPr>
@@ -8413,7 +9416,7 @@
       <w:pPr>
         <w:pStyle w:val="3"/>
       </w:pPr>
-      <w:bookmarkStart w:id="56" w:name="_Toc10228"/>
+      <w:bookmarkStart w:id="58" w:name="_Toc12919"/>
       <w:r>
         <w:rPr>
           <w:rFonts w:hint="eastAsia"/>
@@ -8434,7 +9437,7 @@
       <w:r>
         <w:t xml:space="preserve"> 浏览器启动方式</w:t>
       </w:r>
-      <w:bookmarkEnd w:id="56"/>
+      <w:bookmarkEnd w:id="58"/>
     </w:p>
     <w:p>
       <w:pPr>
@@ -8448,7 +9451,7 @@
       <w:pPr>
         <w:pStyle w:val="2"/>
       </w:pPr>
-      <w:bookmarkStart w:id="57" w:name="_Toc3228"/>
+      <w:bookmarkStart w:id="59" w:name="_Toc22843"/>
       <w:r>
         <w:t>1</w:t>
       </w:r>
@@ -8462,7 +9465,7 @@
       <w:r>
         <w:t>. 设置</w:t>
       </w:r>
-      <w:bookmarkEnd w:id="57"/>
+      <w:bookmarkEnd w:id="59"/>
     </w:p>
     <w:p>
       <w:pPr>
@@ -8503,7 +9506,7 @@
                     </pic:cNvPicPr>
                   </pic:nvPicPr>
                   <pic:blipFill>
-                    <a:blip r:embed="rId22"/>
+                    <a:blip r:embed="rId25"/>
                     <a:stretch>
                       <a:fillRect/>
                     </a:stretch>
@@ -8551,7 +9554,7 @@
           <w:lang w:val="en-US" w:eastAsia="zh-CN"/>
         </w:rPr>
       </w:pPr>
-      <w:bookmarkStart w:id="58" w:name="_Toc3916"/>
+      <w:bookmarkStart w:id="60" w:name="_Toc17321"/>
       <w:r>
         <w:rPr>
           <w:rFonts w:hint="eastAsia"/>
@@ -8562,17 +9565,17 @@
       <w:r>
         <w:t>. 常见问题</w:t>
       </w:r>
-      <w:bookmarkEnd w:id="58"/>
+      <w:bookmarkEnd w:id="60"/>
     </w:p>
     <w:p>
       <w:pPr>
         <w:pStyle w:val="3"/>
       </w:pPr>
-      <w:bookmarkStart w:id="59" w:name="_Toc20850"/>
+      <w:bookmarkStart w:id="61" w:name="_Toc2465"/>
       <w:r>
         <w:t>Q1: 账套密码忘记怎么办？</w:t>
       </w:r>
-      <w:bookmarkEnd w:id="59"/>
+      <w:bookmarkEnd w:id="61"/>
     </w:p>
     <w:p>
       <w:pPr>
@@ -8586,11 +9589,11 @@
       <w:pPr>
         <w:pStyle w:val="3"/>
       </w:pPr>
-      <w:bookmarkStart w:id="60" w:name="_Toc22484"/>
+      <w:bookmarkStart w:id="62" w:name="_Toc927"/>
       <w:r>
         <w:t>Q2: 工具箱不显示自定义工具？</w:t>
       </w:r>
-      <w:bookmarkEnd w:id="60"/>
+      <w:bookmarkEnd w:id="62"/>
     </w:p>
     <w:p>
       <w:pPr>
@@ -8604,11 +9607,11 @@
       <w:pPr>
         <w:pStyle w:val="3"/>
       </w:pPr>
-      <w:bookmarkStart w:id="61" w:name="_Toc7139"/>
+      <w:bookmarkStart w:id="63" w:name="_Toc24292"/>
       <w:r>
         <w:t>Q3: 复制操作失败？</w:t>
       </w:r>
-      <w:bookmarkEnd w:id="61"/>
+      <w:bookmarkEnd w:id="63"/>
     </w:p>
     <w:p>
       <w:pPr>
@@ -8622,11 +9625,11 @@
       <w:pPr>
         <w:pStyle w:val="3"/>
       </w:pPr>
-      <w:bookmarkStart w:id="62" w:name="_Toc20742"/>
+      <w:bookmarkStart w:id="64" w:name="_Toc10895"/>
       <w:r>
         <w:t>Q4: 程序无法启动？</w:t>
       </w:r>
-      <w:bookmarkEnd w:id="62"/>
+      <w:bookmarkEnd w:id="64"/>
     </w:p>
     <w:p>
       <w:pPr>
@@ -8640,61 +9643,61 @@
       <w:pPr>
         <w:pStyle w:val="3"/>
       </w:pPr>
-      <w:bookmarkStart w:id="63" w:name="_Toc22744"/>
+      <w:bookmarkStart w:id="65" w:name="_Toc17294"/>
       <w:r>
         <w:t>Q5: 托盘快捷键不生效？</w:t>
       </w:r>
-      <w:bookmarkEnd w:id="63"/>
+      <w:bookmarkEnd w:id="65"/>
     </w:p>
     <w:p>
       <w:pPr>
         <w:pStyle w:val="3"/>
       </w:pPr>
-      <w:bookmarkStart w:id="64" w:name="_Toc2587"/>
+      <w:bookmarkStart w:id="66" w:name="_Toc1854"/>
       <w:r>
         <w:t>A: 快捷键可能被其他程序占用。建议换一个不常用的快捷键组合，或关闭其他可能占用快捷键的程序后再试。</w:t>
       </w:r>
-      <w:bookmarkEnd w:id="64"/>
+      <w:bookmarkEnd w:id="66"/>
     </w:p>
     <w:p>
       <w:pPr>
         <w:pStyle w:val="3"/>
       </w:pPr>
-      <w:bookmarkStart w:id="65" w:name="_Toc8406"/>
+      <w:bookmarkStart w:id="67" w:name="_Toc18453"/>
       <w:r>
         <w:t>Q6: 复制表单后目标账套报错？</w:t>
       </w:r>
-      <w:bookmarkEnd w:id="65"/>
+      <w:bookmarkEnd w:id="67"/>
     </w:p>
     <w:p>
       <w:pPr>
         <w:pStyle w:val="3"/>
       </w:pPr>
-      <w:bookmarkStart w:id="66" w:name="_Toc3851"/>
+      <w:bookmarkStart w:id="68" w:name="_Toc31239"/>
       <w:r>
         <w:t>A: 使用"复制Win表单"时，建议勾选"同时复制关联存储过程"、"复制编码规则"、"复制标准查询"选项，确保关联数据完整复制到目标账套。</w:t>
       </w:r>
-      <w:bookmarkEnd w:id="66"/>
+      <w:bookmarkEnd w:id="68"/>
     </w:p>
     <w:p>
       <w:pPr>
         <w:pStyle w:val="3"/>
       </w:pPr>
-      <w:bookmarkStart w:id="67" w:name="_Toc22383"/>
+      <w:bookmarkStart w:id="69" w:name="_Toc32316"/>
       <w:r>
         <w:t>Q7: 账套搜索不到？</w:t>
       </w:r>
-      <w:bookmarkEnd w:id="67"/>
+      <w:bookmarkEnd w:id="69"/>
     </w:p>
     <w:p>
       <w:pPr>
         <w:pStyle w:val="3"/>
       </w:pPr>
-      <w:bookmarkStart w:id="68" w:name="_Toc1708"/>
+      <w:bookmarkStart w:id="70" w:name="_Toc32045"/>
       <w:r>
         <w:t>A: 账套搜索支持拼音首字母搜索（如输入"CS"可找到"测试"账套），也支持账套代码、名称和服务器地址的模糊搜索。请检查搜索关键词是否正确。</w:t>
       </w:r>
-      <w:bookmarkEnd w:id="68"/>
+      <w:bookmarkEnd w:id="70"/>
     </w:p>
     <w:p>
       <w:pPr>
@@ -9219,7 +10222,7 @@
       <w:szCs w:val="22"/>
     </w:rPr>
   </w:style>
-  <w:style w:type="character" w:default="1" w:styleId="14">
+  <w:style w:type="character" w:default="1" w:styleId="15">
     <w:name w:val="Default Paragraph Font"/>
     <w:semiHidden/>
     <w:qFormat/>
@@ -9241,7 +10244,7 @@
   </w:style>
   <w:style w:type="paragraph" w:styleId="8">
     <w:name w:val="endnote text"/>
-    <w:link w:val="20"/>
+    <w:link w:val="21"/>
     <w:semiHidden/>
     <w:unhideWhenUsed/>
     <w:qFormat/>
@@ -9264,7 +10267,7 @@
   </w:style>
   <w:style w:type="paragraph" w:styleId="10">
     <w:name w:val="footnote text"/>
-    <w:link w:val="19"/>
+    <w:link w:val="20"/>
     <w:semiHidden/>
     <w:unhideWhenUsed/>
     <w:qFormat/>
@@ -9305,7 +10308,26 @@
       <w:szCs w:val="52"/>
     </w:rPr>
   </w:style>
-  <w:style w:type="character" w:styleId="15">
+  <w:style w:type="table" w:styleId="14">
+    <w:name w:val="Table Grid"/>
+    <w:basedOn w:val="13"/>
+    <w:uiPriority w:val="0"/>
+    <w:pPr>
+      <w:widowControl w:val="0"/>
+      <w:jc w:val="both"/>
+    </w:pPr>
+    <w:tblPr>
+      <w:tblBorders>
+        <w:top w:val="single" w:color="auto" w:sz="4" w:space="0"/>
+        <w:left w:val="single" w:color="auto" w:sz="4" w:space="0"/>
+        <w:bottom w:val="single" w:color="auto" w:sz="4" w:space="0"/>
+        <w:right w:val="single" w:color="auto" w:sz="4" w:space="0"/>
+        <w:insideH w:val="single" w:color="auto" w:sz="4" w:space="0"/>
+        <w:insideV w:val="single" w:color="auto" w:sz="4" w:space="0"/>
+      </w:tblBorders>
+    </w:tblPr>
+  </w:style>
+  <w:style w:type="character" w:styleId="16">
     <w:name w:val="endnote reference"/>
     <w:semiHidden/>
     <w:unhideWhenUsed/>
@@ -9315,7 +10337,7 @@
       <w:vertAlign w:val="superscript"/>
     </w:rPr>
   </w:style>
-  <w:style w:type="character" w:styleId="16">
+  <w:style w:type="character" w:styleId="17">
     <w:name w:val="Hyperlink"/>
     <w:unhideWhenUsed/>
     <w:qFormat/>
@@ -9325,7 +10347,7 @@
       <w:u w:val="single"/>
     </w:rPr>
   </w:style>
-  <w:style w:type="character" w:styleId="17">
+  <w:style w:type="character" w:styleId="18">
     <w:name w:val="footnote reference"/>
     <w:semiHidden/>
     <w:unhideWhenUsed/>
@@ -9335,7 +10357,7 @@
       <w:vertAlign w:val="superscript"/>
     </w:rPr>
   </w:style>
-  <w:style w:type="paragraph" w:styleId="18">
+  <w:style w:type="paragraph" w:styleId="19">
     <w:name w:val="List Paragraph"/>
     <w:qFormat/>
     <w:uiPriority w:val="0"/>
@@ -9345,7 +10367,7 @@
       <w:szCs w:val="22"/>
     </w:rPr>
   </w:style>
-  <w:style w:type="character" w:customStyle="1" w:styleId="19">
+  <w:style w:type="character" w:customStyle="1" w:styleId="20">
     <w:name w:val="Footnote Text Char"/>
     <w:link w:val="10"/>
     <w:semiHidden/>
@@ -9357,7 +10379,7 @@
       <w:szCs w:val="20"/>
     </w:rPr>
   </w:style>
-  <w:style w:type="character" w:customStyle="1" w:styleId="20">
+  <w:style w:type="character" w:customStyle="1" w:styleId="21">
     <w:name w:val="Endnote Text Char"/>
     <w:link w:val="8"/>
     <w:semiHidden/>

</xml_diff>

<commit_message>
fix(update): 升级成功后 cmd 窗体自动关闭 + _update.log 自动清理 (v2.3.14)
- PerformUpdate/PerformZipUpdate 启动 bat 的 ProcessStartInfo：
  - UseShellExecute: true → false（让 CreateNoWindow=true 真正生效）
  - Arguments: /c start "" /b "bat.bat" → /c ""bat.bat""（避免嵌套 cmd）
  - 加 RedirectStandardOutput/Error=true（阻止 cmd 调用 AllocConsole）
- 两个 bat 末尾加 del ""{logPath}"" >nul 2>&1（升级成功自动清日志，失败时 exit /b 1 跳过清理保留证据）
- 顺手 bump 版本号 2.3.13 → 2.3.14

worklist: worklist/2026-07-09-fix-update-cmd-not-close-and-log-not-cleaned.md
</commit_message>
<xml_diff>
--- a/A3工具箱_用户手册.docx
+++ b/A3工具箱_用户手册.docx
@@ -70,7 +70,7 @@
           <w:szCs w:val="24"/>
           <w:lang w:val="en-US" w:eastAsia="zh-CN"/>
         </w:rPr>
-        <w:t>2.0</w:t>
+        <w:t>3.0</w:t>
       </w:r>
     </w:p>
     <w:p/>
@@ -758,6 +758,118 @@
               </w:rPr>
               <w:t>2026-07-07</w:t>
             </w:r>
+          </w:p>
+        </w:tc>
+      </w:tr>
+      <w:tr>
+        <w:tblPrEx>
+          <w:tblBorders>
+            <w:top w:val="single" w:color="auto" w:sz="4" w:space="0"/>
+            <w:left w:val="single" w:color="auto" w:sz="4" w:space="0"/>
+            <w:bottom w:val="single" w:color="auto" w:sz="4" w:space="0"/>
+            <w:right w:val="single" w:color="auto" w:sz="4" w:space="0"/>
+            <w:insideH w:val="single" w:color="auto" w:sz="4" w:space="0"/>
+            <w:insideV w:val="single" w:color="auto" w:sz="4" w:space="0"/>
+          </w:tblBorders>
+          <w:tblCellMar>
+            <w:top w:w="0" w:type="dxa"/>
+            <w:left w:w="108" w:type="dxa"/>
+            <w:bottom w:w="0" w:type="dxa"/>
+            <w:right w:w="108" w:type="dxa"/>
+          </w:tblCellMar>
+        </w:tblPrEx>
+        <w:tc>
+          <w:tcPr>
+            <w:tcW w:w="1547" w:type="dxa"/>
+          </w:tcPr>
+          <w:p>
+            <w:pPr>
+              <w:jc w:val="center"/>
+              <w:rPr>
+                <w:rFonts w:hint="default"/>
+                <w:vertAlign w:val="baseline"/>
+                <w:lang w:val="en-US" w:eastAsia="zh-CN"/>
+              </w:rPr>
+            </w:pPr>
+            <w:r>
+              <w:rPr>
+                <w:rFonts w:hint="eastAsia"/>
+                <w:vertAlign w:val="baseline"/>
+                <w:lang w:val="en-US" w:eastAsia="zh-CN"/>
+              </w:rPr>
+              <w:t>V2.3.0</w:t>
+            </w:r>
+          </w:p>
+        </w:tc>
+        <w:tc>
+          <w:tcPr>
+            <w:tcW w:w="1586" w:type="dxa"/>
+          </w:tcPr>
+          <w:p>
+            <w:pPr>
+              <w:jc w:val="center"/>
+              <w:rPr>
+                <w:rFonts w:hint="default"/>
+                <w:vertAlign w:val="baseline"/>
+                <w:lang w:val="en-US" w:eastAsia="zh-CN"/>
+              </w:rPr>
+            </w:pPr>
+            <w:r>
+              <w:rPr>
+                <w:rFonts w:hint="eastAsia"/>
+                <w:vertAlign w:val="baseline"/>
+                <w:lang w:val="en-US" w:eastAsia="zh-CN"/>
+              </w:rPr>
+              <w:t>wq</w:t>
+            </w:r>
+          </w:p>
+        </w:tc>
+        <w:tc>
+          <w:tcPr>
+            <w:tcW w:w="4338" w:type="dxa"/>
+          </w:tcPr>
+          <w:p>
+            <w:pPr>
+              <w:jc w:val="left"/>
+              <w:rPr>
+                <w:rFonts w:hint="default"/>
+                <w:vertAlign w:val="baseline"/>
+                <w:lang w:val="en-US" w:eastAsia="zh-CN"/>
+              </w:rPr>
+            </w:pPr>
+            <w:r>
+              <w:rPr>
+                <w:rFonts w:hint="eastAsia"/>
+                <w:vertAlign w:val="baseline"/>
+                <w:lang w:val="en-US" w:eastAsia="zh-CN"/>
+              </w:rPr>
+              <w:t>工具新增自动更新功能</w:t>
+            </w:r>
+          </w:p>
+        </w:tc>
+        <w:tc>
+          <w:tcPr>
+            <w:tcW w:w="2491" w:type="dxa"/>
+          </w:tcPr>
+          <w:p>
+            <w:pPr>
+              <w:jc w:val="center"/>
+              <w:rPr>
+                <w:rFonts w:hint="default"/>
+                <w:vertAlign w:val="baseline"/>
+                <w:lang w:val="en-US" w:eastAsia="zh-CN"/>
+              </w:rPr>
+            </w:pPr>
+            <w:r>
+              <w:rPr>
+                <w:rFonts w:hint="eastAsia"/>
+                <w:vertAlign w:val="baseline"/>
+                <w:lang w:val="en-US" w:eastAsia="zh-CN"/>
+              </w:rPr>
+              <w:t>2026-07-09</w:t>
+            </w:r>
+            <w:bookmarkStart w:id="72" w:name="_GoBack"/>
+            <w:bookmarkEnd w:id="72"/>
           </w:p>
         </w:tc>
       </w:tr>
@@ -9177,8 +9289,6 @@
         </w:rPr>
         <w:t>14</w:t>
       </w:r>
-      <w:bookmarkStart w:id="72" w:name="_GoBack"/>
-      <w:bookmarkEnd w:id="72"/>
       <w:r>
         <w:t>工具扩展</w:t>
       </w:r>

</xml_diff>